<commit_message>
fix: update assurant report logo
</commit_message>
<xml_diff>
--- a/resources/reports/assurant_template.docx
+++ b/resources/reports/assurant_template.docx
@@ -1,6 +1,6 @@
 
 <file path=word/document.xml><?xml version="1.0" encoding="utf-8"?>
-<w:document xmlns:wpc="http://schemas.microsoft.com/office/word/2010/wordprocessingCanvas" xmlns:cx="http://schemas.microsoft.com/office/drawing/2014/chartex" xmlns:cx1="http://schemas.microsoft.com/office/drawing/2015/9/8/chartex" xmlns:cx2="http://schemas.microsoft.com/office/drawing/2015/10/21/chartex" xmlns:cx3="http://schemas.microsoft.com/office/drawing/2016/5/9/chartex" xmlns:cx4="http://schemas.microsoft.com/office/drawing/2016/5/10/chartex" xmlns:cx5="http://schemas.microsoft.com/office/drawing/2016/5/11/chartex" xmlns:cx6="http://schemas.microsoft.com/office/drawing/2016/5/12/chartex" xmlns:cx7="http://schemas.microsoft.com/office/drawing/2016/5/13/chartex" xmlns:cx8="http://schemas.microsoft.com/office/drawing/2016/5/14/chartex" xmlns:mc="http://schemas.openxmlformats.org/markup-compatibility/2006" xmlns:aink="http://schemas.microsoft.com/office/drawing/2016/ink" xmlns:am3d="http://schemas.microsoft.com/office/drawing/2017/model3d" xmlns:o="urn:schemas-microsoft-com:office:office" xmlns:oel="http://schemas.microsoft.com/office/2019/extlst" xmlns:r="http://schemas.openxmlformats.org/officeDocument/2006/relationships" xmlns:m="http://schemas.openxmlformats.org/officeDocument/2006/math" xmlns:v="urn:schemas-microsoft-com:vml" xmlns:wp14="http://schemas.microsoft.com/office/word/2010/wordprocessingDrawing" xmlns:wp="http://schemas.openxmlformats.org/drawingml/2006/wordprocessingDrawing" xmlns:w10="urn:schemas-microsoft-com:office:word" xmlns:w="http://schemas.openxmlformats.org/wordprocessingml/2006/main" xmlns:w14="http://schemas.microsoft.com/office/word/2010/wordml" xmlns:w15="http://schemas.microsoft.com/office/word/2012/wordml" xmlns:w16cex="http://schemas.microsoft.com/office/word/2018/wordml/cex" xmlns:w16cid="http://schemas.microsoft.com/office/word/2016/wordml/cid" xmlns:w16="http://schemas.microsoft.com/office/word/2018/wordml" xmlns:w16du="http://schemas.microsoft.com/office/word/2023/wordml/word16du" xmlns:w16sdtdh="http://schemas.microsoft.com/office/word/2020/wordml/sdtdatahash" xmlns:w16sdtfl="http://schemas.microsoft.com/office/word/2024/wordml/sdtformatlock" xmlns:w16se="http://schemas.microsoft.com/office/word/2015/wordml/symex" xmlns:wpg="http://schemas.microsoft.com/office/word/2010/wordprocessingGroup" xmlns:wpi="http://schemas.microsoft.com/office/word/2010/wordprocessingInk" xmlns:wne="http://schemas.microsoft.com/office/word/2006/wordml" xmlns:wps="http://schemas.microsoft.com/office/word/2010/wordprocessingShape" xmlns:a="http://schemas.openxmlformats.org/drawingml/2006/main" xmlns:pic="http://schemas.openxmlformats.org/drawingml/2006/picture" mc:Ignorable="w14 w15 w16se w16cid w16 w16cex w16sdtdh w16sdtfl w16du wp14">
+<w:document xmlns:wpc="http://schemas.microsoft.com/office/word/2010/wordprocessingCanvas" xmlns:cx="http://schemas.microsoft.com/office/drawing/2014/chartex" xmlns:cx1="http://schemas.microsoft.com/office/drawing/2015/9/8/chartex" xmlns:cx2="http://schemas.microsoft.com/office/drawing/2015/10/21/chartex" xmlns:cx3="http://schemas.microsoft.com/office/drawing/2016/5/9/chartex" xmlns:cx4="http://schemas.microsoft.com/office/drawing/2016/5/10/chartex" xmlns:cx5="http://schemas.microsoft.com/office/drawing/2016/5/11/chartex" xmlns:cx6="http://schemas.microsoft.com/office/drawing/2016/5/12/chartex" xmlns:cx7="http://schemas.microsoft.com/office/drawing/2016/5/13/chartex" xmlns:cx8="http://schemas.microsoft.com/office/drawing/2016/5/14/chartex" xmlns:mc="http://schemas.openxmlformats.org/markup-compatibility/2006" xmlns:aink="http://schemas.microsoft.com/office/drawing/2016/ink" xmlns:am3d="http://schemas.microsoft.com/office/drawing/2017/model3d" xmlns:o="urn:schemas-microsoft-com:office:office" xmlns:oel="http://schemas.microsoft.com/office/2019/extlst" xmlns:r="http://schemas.openxmlformats.org/officeDocument/2006/relationships" xmlns:m="http://schemas.openxmlformats.org/officeDocument/2006/math" xmlns:v="urn:schemas-microsoft-com:vml" xmlns:wp14="http://schemas.microsoft.com/office/word/2010/wordprocessingDrawing" xmlns:wp="http://schemas.openxmlformats.org/drawingml/2006/wordprocessingDrawing" xmlns:w10="urn:schemas-microsoft-com:office:word" xmlns:w="http://schemas.openxmlformats.org/wordprocessingml/2006/main" xmlns:w14="http://schemas.microsoft.com/office/word/2010/wordml" xmlns:w15="http://schemas.microsoft.com/office/word/2012/wordml" xmlns:w16cex="http://schemas.microsoft.com/office/word/2018/wordml/cex" xmlns:w16cid="http://schemas.microsoft.com/office/word/2016/wordml/cid" xmlns:w16="http://schemas.microsoft.com/office/word/2018/wordml" xmlns:w16du="http://schemas.microsoft.com/office/word/2023/wordml/word16du" xmlns:w16sdtdh="http://schemas.microsoft.com/office/word/2020/wordml/sdtdatahash" xmlns:w16sdtfl="http://schemas.microsoft.com/office/word/2024/wordml/sdtformatlock" xmlns:w16se="http://schemas.microsoft.com/office/word/2015/wordml/symex" xmlns:wpg="http://schemas.microsoft.com/office/word/2010/wordprocessingGroup" xmlns:wpi="http://schemas.microsoft.com/office/word/2010/wordprocessingInk" xmlns:wne="http://schemas.microsoft.com/office/word/2006/wordml" xmlns:wps="http://schemas.microsoft.com/office/word/2010/wordprocessingShape" xmlns:a="http://schemas.openxmlformats.org/drawingml/2006/main" xmlns:pic="http://schemas.openxmlformats.org/drawingml/2006/picture" xmlns:a14="http://schemas.microsoft.com/office/drawing/2010/main" mc:Ignorable="w14 w15 w16se w16cid w16 w16cex w16sdtdh w16sdtfl w16du wp14">
   <w:body>
     <w:p xmlns:wp14="http://schemas.microsoft.com/office/word/2010/wordml" wp14:textId="77777777">
       <w:pPr>
@@ -11,29 +11,226 @@
         </w:rPr>
       </w:pPr>
       <w:r>
+        <w:rPr/>
         <w:t>LAUDO TÉCNICO</w:t>
       </w:r>
     </w:p>
-    <w:p xmlns:wp14="http://schemas.microsoft.com/office/word/2010/wordml" wp14:textId="77777777">
+    <w:p xmlns:wp14="http://schemas.microsoft.com/office/word/2010/wordml" wp14:textId="4BC73E01">
       <w:pPr>
-        <w:pBdr>
-          <w:top w:val="nil"/>
-          <w:left w:val="nil"/>
-          <w:bottom w:val="nil"/>
-          <w:right w:val="nil"/>
-          <w:between w:val="nil"/>
-        </w:pBdr>
+        <w:pStyle w:val="Normal"/>
         <w:spacing w:before="199"/>
-        <w:rPr>
-          <w:rFonts w:ascii="Arial" w:hAnsi="Arial" w:eastAsia="Arial" w:cs="Arial"/>
-          <w:b/>
-          <w:bCs/>
-          <w:color w:val="000000"/>
-          <w:sz w:val="20"/>
-          <w:szCs w:val="20"/>
-        </w:rPr>
+      </w:pPr>
+      <w:r>
+        <w:drawing>
+          <wp:inline xmlns:wp14="http://schemas.microsoft.com/office/word/2010/wordprocessingDrawing" wp14:editId="1263CB04" wp14:anchorId="4E11E8C0">
+            <wp:extent cx="6477120" cy="203622"/>
+            <wp:effectExtent l="0" t="0" r="0" b="0"/>
+            <wp:docPr id="806844454" name="drawing" title="Textbox 1, Caixa de texto"/>
+            <wp:cNvGraphicFramePr>
+              <a:graphicFrameLocks noChangeAspect="1"/>
+            </wp:cNvGraphicFramePr>
+            <a:graphic>
+              <a:graphicData xmlns:a="http://schemas.openxmlformats.org/drawingml/2006/main" uri="http://schemas.openxmlformats.org/drawingml/2006/picture">
+                <pic:pic xmlns:pic="http://schemas.openxmlformats.org/drawingml/2006/picture">
+                  <pic:nvPicPr>
+                    <pic:cNvPr id="806844454" name="Picture 806844454"/>
+                    <pic:cNvPicPr/>
+                  </pic:nvPicPr>
+                  <pic:blipFill>
+                    <a:blip xmlns:r="http://schemas.openxmlformats.org/officeDocument/2006/relationships" r:embed="rId1733855470">
+                      <a:extLst>
+                        <a:ext uri="{28A0092B-C50C-407E-A947-70E740481C1C}">
+                          <a14:useLocalDpi xmlns:a14="http://schemas.microsoft.com/office/drawing/2010/main"/>
+                        </a:ext>
+                      </a:extLst>
+                    </a:blip>
+                    <a:stretch>
+                      <a:fillRect/>
+                    </a:stretch>
+                  </pic:blipFill>
+                  <pic:spPr>
+                    <a:xfrm rot="0">
+                      <a:off x="0" y="0"/>
+                      <a:ext cx="6477120" cy="203622"/>
+                    </a:xfrm>
+                    <a:prstGeom prst="rect">
+                      <a:avLst/>
+                    </a:prstGeom>
+                  </pic:spPr>
+                </pic:pic>
+              </a:graphicData>
+            </a:graphic>
+          </wp:inline>
+        </w:drawing>
+      </w:r>
+    </w:p>
+    <w:p>
+      <w:pPr>
+        <w:pStyle w:val="Normal"/>
       </w:pPr>
     </w:p>
+    <w:tbl>
+      <w:tblPr>
+        <w:tblStyle w:val="TableGrid"/>
+        <w:tblW w:w="0" w:type="auto"/>
+        <w:tblBorders>
+          <w:top w:val="none" w:color="000000" w:themeColor="text1" w:sz="12"/>
+          <w:left w:val="none" w:color="000000" w:themeColor="text1" w:sz="12"/>
+          <w:bottom w:val="none" w:color="000000" w:themeColor="text1" w:sz="12"/>
+          <w:right w:val="none" w:color="000000" w:themeColor="text1" w:sz="12"/>
+          <w:insideH w:val="none" w:color="000000" w:themeColor="text1" w:sz="12"/>
+          <w:insideV w:val="none" w:color="000000" w:themeColor="text1" w:sz="12"/>
+        </w:tblBorders>
+        <w:tblLook w:val="06A0" w:firstRow="1" w:lastRow="0" w:firstColumn="1" w:lastColumn="0" w:noHBand="1" w:noVBand="1"/>
+      </w:tblPr>
+      <w:tblGrid>
+        <w:gridCol w:w="1648"/>
+        <w:gridCol w:w="4248"/>
+        <w:gridCol w:w="1380"/>
+        <w:gridCol w:w="2984"/>
+      </w:tblGrid>
+      <w:tr>
+        <w:trPr>
+          <w:trHeight w:val="567"/>
+        </w:trPr>
+        <w:tc>
+          <w:tcPr>
+            <w:tcW w:w="1648" w:type="dxa"/>
+            <w:tcMar/>
+            <w:vAlign w:val="center"/>
+          </w:tcPr>
+          <w:p>
+            <w:pPr>
+              <w:pStyle w:val="Normal"/>
+              <w:jc w:val="left"/>
+              <w:rPr>
+                <w:rFonts w:ascii="Calibri" w:hAnsi="Calibri" w:eastAsia="Calibri" w:cs="Calibri"/>
+                <w:b w:val="1"/>
+                <w:bCs w:val="1"/>
+                <w:color w:val="000000" w:themeColor="text1" w:themeTint="FF" w:themeShade="FF"/>
+                <w:sz w:val="28"/>
+                <w:szCs w:val="28"/>
+              </w:rPr>
+            </w:pPr>
+            <w:r>
+              <w:rPr>
+                <w:rFonts w:ascii="Calibri" w:hAnsi="Calibri" w:eastAsia="Calibri" w:cs="Calibri"/>
+                <w:b w:val="1"/>
+                <w:bCs w:val="1"/>
+                <w:color w:val="000000" w:themeColor="text1" w:themeTint="FF" w:themeShade="FF"/>
+                <w:sz w:val="28"/>
+                <w:szCs w:val="28"/>
+              </w:rPr>
+              <w:t>Assistência</w:t>
+            </w:r>
+            <w:r>
+              <w:rPr>
+                <w:rFonts w:ascii="Calibri" w:hAnsi="Calibri" w:eastAsia="Calibri" w:cs="Calibri"/>
+                <w:b w:val="1"/>
+                <w:bCs w:val="1"/>
+                <w:color w:val="000000" w:themeColor="text1" w:themeTint="FF" w:themeShade="FF"/>
+                <w:sz w:val="28"/>
+                <w:szCs w:val="28"/>
+              </w:rPr>
+              <w:t>:</w:t>
+            </w:r>
+          </w:p>
+        </w:tc>
+        <w:tc>
+          <w:tcPr>
+            <w:tcW w:w="4248" w:type="dxa"/>
+            <w:tcMar/>
+            <w:vAlign w:val="center"/>
+          </w:tcPr>
+          <w:p>
+            <w:pPr>
+              <w:pStyle w:val="Normal"/>
+              <w:spacing w:before="0" w:beforeAutospacing="off"/>
+              <w:jc w:val="left"/>
+              <w:rPr>
+                <w:rFonts w:ascii="Calibri" w:hAnsi="Calibri" w:eastAsia="Calibri" w:cs="Calibri"/>
+                <w:b w:val="0"/>
+                <w:bCs w:val="0"/>
+                <w:color w:val="000000" w:themeColor="text1" w:themeTint="FF" w:themeShade="FF"/>
+                <w:sz w:val="22"/>
+                <w:szCs w:val="22"/>
+              </w:rPr>
+            </w:pPr>
+            <w:r>
+              <w:rPr>
+                <w:rFonts w:ascii="Calibri" w:hAnsi="Calibri" w:eastAsia="Calibri" w:cs="Calibri"/>
+                <w:b w:val="0"/>
+                <w:bCs w:val="0"/>
+                <w:color w:val="000000" w:themeColor="text1" w:themeTint="FF" w:themeShade="FF"/>
+                <w:sz w:val="22"/>
+                <w:szCs w:val="22"/>
+              </w:rPr>
+              <w:t>ASSITÊNCIA TÉCNICA LTDA</w:t>
+            </w:r>
+          </w:p>
+        </w:tc>
+        <w:tc>
+          <w:tcPr>
+            <w:tcW w:w="1380" w:type="dxa"/>
+            <w:tcMar/>
+            <w:vAlign w:val="center"/>
+          </w:tcPr>
+          <w:p>
+            <w:pPr>
+              <w:pStyle w:val="Normal"/>
+              <w:jc w:val="left"/>
+              <w:rPr>
+                <w:b w:val="1"/>
+                <w:bCs w:val="1"/>
+                <w:sz w:val="28"/>
+                <w:szCs w:val="28"/>
+                <w:u w:val="none"/>
+              </w:rPr>
+            </w:pPr>
+            <w:r>
+              <w:rPr>
+                <w:b w:val="1"/>
+                <w:bCs w:val="1"/>
+                <w:sz w:val="28"/>
+                <w:szCs w:val="28"/>
+                <w:u w:val="none"/>
+              </w:rPr>
+              <w:t>CNPJ:</w:t>
+            </w:r>
+          </w:p>
+        </w:tc>
+        <w:tc>
+          <w:tcPr>
+            <w:tcW w:w="2984" w:type="dxa"/>
+            <w:tcMar/>
+            <w:vAlign w:val="center"/>
+          </w:tcPr>
+          <w:p>
+            <w:pPr>
+              <w:pBdr>
+                <w:top w:val="nil" w:color="FF000000" w:sz="0" w:space="0"/>
+                <w:left w:val="nil" w:color="FF000000" w:sz="0" w:space="0"/>
+                <w:bottom w:val="nil" w:color="FF000000" w:sz="0" w:space="0"/>
+                <w:right w:val="nil" w:color="FF000000" w:sz="0" w:space="0"/>
+                <w:between w:val="nil" w:color="FF000000" w:sz="0" w:space="0"/>
+              </w:pBdr>
+              <w:spacing w:before="0" w:beforeAutospacing="off"/>
+              <w:ind w:left="0"/>
+              <w:jc w:val="left"/>
+              <w:rPr>
+                <w:color w:val="000000" w:themeColor="text1" w:themeTint="FF" w:themeShade="FF"/>
+              </w:rPr>
+            </w:pPr>
+            <w:r>
+              <w:rPr>
+                <w:color w:val="000000" w:themeColor="text1" w:themeTint="FF" w:themeShade="FF"/>
+              </w:rPr>
+              <w:t>22245983/0001-69</w:t>
+            </w:r>
+          </w:p>
+        </w:tc>
+      </w:tr>
+    </w:tbl>
     <w:p xmlns:wp14="http://schemas.microsoft.com/office/word/2010/wordml" wp14:textId="77777777">
       <w:pPr>
         <w:pBdr>
@@ -57,75 +254,20 @@
           <w:pgMar w:top="1500" w:right="1020" w:bottom="280" w:left="620" w:header="720" w:footer="720" w:gutter="0"/>
           <w:pgNumType w:start="1"/>
           <w:cols w:space="720"/>
+          <w:headerReference w:type="default" r:id="R805927ff357d41f5"/>
+          <w:footerReference w:type="default" r:id="Ra62a8096283b43be"/>
         </w:sectPr>
       </w:pPr>
     </w:p>
-    <w:p xmlns:wp14="http://schemas.microsoft.com/office/word/2010/wordml" wp14:textId="77777777">
+    <w:p xmlns:wp14="http://schemas.microsoft.com/office/word/2010/wordml" wp14:textId="56B5F3AB">
       <w:pPr>
-        <w:pStyle w:val="Ttulo2"/>
-        <w:spacing w:before="44"/>
-        <w:ind w:firstLine="296"/>
-      </w:pPr>
-      <w:r>
-        <w:t>Assistência:</w:t>
-      </w:r>
-    </w:p>
-    <w:p xmlns:wp14="http://schemas.microsoft.com/office/word/2010/wordml" wp14:textId="77777777">
-      <w:pPr>
-        <w:pBdr>
-          <w:top w:val="nil"/>
-          <w:left w:val="nil"/>
-          <w:bottom w:val="nil"/>
-          <w:right w:val="nil"/>
-          <w:between w:val="nil"/>
-        </w:pBdr>
-        <w:spacing w:before="82"/>
-        <w:ind w:left="284"/>
+        <w:pStyle w:val="Normal"/>
+        <w:bidi w:val="0"/>
         <w:rPr>
-          <w:color w:val="000000"/>
-        </w:rPr>
-      </w:pPr>
-      <w:r>
-        <w:br w:type="column"/>
-      </w:r>
-      <w:r>
-        <w:rPr>
-          <w:color w:val="000000"/>
-        </w:rPr>
-        <w:t>ASSISTÊNCIA TÉCNICA LTDA</w:t>
-      </w:r>
-    </w:p>
-    <w:p xmlns:wp14="http://schemas.microsoft.com/office/word/2010/wordml" wp14:textId="77777777">
-      <w:pPr>
-        <w:pStyle w:val="Ttulo1"/>
-        <w:ind w:firstLine="296"/>
-        <w:rPr>
-          <w:u w:val="none"/>
-        </w:rPr>
-      </w:pPr>
-      <w:r>
-        <w:br w:type="column"/>
-      </w:r>
-      <w:r>
-        <w:rPr>
-          <w:u w:val="none"/>
-        </w:rPr>
-        <w:t>CNPJ:</w:t>
-      </w:r>
-    </w:p>
-    <w:p xmlns:wp14="http://schemas.microsoft.com/office/word/2010/wordml" wp14:textId="77777777">
-      <w:pPr>
-        <w:pBdr>
-          <w:top w:val="nil"/>
-          <w:left w:val="nil"/>
-          <w:bottom w:val="nil"/>
-          <w:right w:val="nil"/>
-          <w:between w:val="nil"/>
-        </w:pBdr>
-        <w:spacing w:before="82"/>
-        <w:ind w:left="268"/>
-        <w:rPr>
-          <w:color w:val="000000"/>
+          <w:b w:val="0"/>
+          <w:bCs w:val="0"/>
+          <w:sz w:val="22"/>
+          <w:szCs w:val="22"/>
         </w:rPr>
         <w:sectPr>
           <w:type w:val="continuous"/>
@@ -137,51 +279,220 @@
             <w:col w:w="2538" w:space="39"/>
             <w:col w:w="2538"/>
           </w:cols>
+          <w:headerReference w:type="default" r:id="R02e36566332e4701"/>
+          <w:footerReference w:type="default" r:id="R66d3ad01f2734d00"/>
         </w:sectPr>
       </w:pPr>
+    </w:p>
+    <w:p xmlns:wp14="http://schemas.microsoft.com/office/word/2010/wordml" wp14:textId="61418E19">
+      <w:pPr>
+        <w:pStyle w:val="Normal"/>
+        <w:pBdr>
+          <w:top w:val="nil" w:color="FF000000" w:sz="0" w:space="0"/>
+          <w:left w:val="nil" w:color="FF000000" w:sz="0" w:space="0"/>
+          <w:bottom w:val="nil" w:color="FF000000" w:sz="0" w:space="0"/>
+          <w:right w:val="nil" w:color="FF000000" w:sz="0" w:space="0"/>
+          <w:between w:val="nil" w:color="FF000000" w:sz="0" w:space="0"/>
+        </w:pBdr>
+      </w:pPr>
       <w:r>
-        <w:br w:type="column"/>
-      </w:r>
-      <w:r>
-        <w:rPr>
-          <w:color w:val="000000"/>
-        </w:rPr>
-        <w:t>22245983/0001-69</w:t>
+        <w:drawing>
+          <wp:inline xmlns:wp14="http://schemas.microsoft.com/office/word/2010/wordprocessingDrawing" wp14:editId="7079CD71" wp14:anchorId="0BC74CE9">
+            <wp:extent cx="6477120" cy="203622"/>
+            <wp:effectExtent l="0" t="0" r="0" b="0"/>
+            <wp:docPr id="1131661210" name="drawing" title="Textbox 2, Caixa de texto"/>
+            <wp:cNvGraphicFramePr>
+              <a:graphicFrameLocks noChangeAspect="1"/>
+            </wp:cNvGraphicFramePr>
+            <a:graphic>
+              <a:graphicData xmlns:a="http://schemas.openxmlformats.org/drawingml/2006/main" uri="http://schemas.openxmlformats.org/drawingml/2006/picture">
+                <pic:pic xmlns:pic="http://schemas.openxmlformats.org/drawingml/2006/picture">
+                  <pic:nvPicPr>
+                    <pic:cNvPr id="1131661210" name="Picture 1131661210"/>
+                    <pic:cNvPicPr/>
+                  </pic:nvPicPr>
+                  <pic:blipFill>
+                    <a:blip xmlns:r="http://schemas.openxmlformats.org/officeDocument/2006/relationships" r:embed="rId1576332916">
+                      <a:extLst>
+                        <a:ext uri="{28A0092B-C50C-407E-A947-70E740481C1C}">
+                          <a14:useLocalDpi xmlns:a14="http://schemas.microsoft.com/office/drawing/2010/main"/>
+                        </a:ext>
+                      </a:extLst>
+                    </a:blip>
+                    <a:stretch>
+                      <a:fillRect/>
+                    </a:stretch>
+                  </pic:blipFill>
+                  <pic:spPr>
+                    <a:xfrm rot="0">
+                      <a:off x="0" y="0"/>
+                      <a:ext cx="6477120" cy="203622"/>
+                    </a:xfrm>
+                    <a:prstGeom prst="rect">
+                      <a:avLst/>
+                    </a:prstGeom>
+                  </pic:spPr>
+                </pic:pic>
+              </a:graphicData>
+            </a:graphic>
+          </wp:inline>
+        </w:drawing>
       </w:r>
     </w:p>
     <w:p xmlns:wp14="http://schemas.microsoft.com/office/word/2010/wordml" wp14:textId="77777777">
       <w:pPr>
         <w:pBdr>
-          <w:top w:val="nil"/>
-          <w:left w:val="nil"/>
-          <w:bottom w:val="nil"/>
-          <w:right w:val="nil"/>
-          <w:between w:val="nil"/>
+          <w:top w:val="nil" w:color="FF000000" w:sz="0" w:space="0"/>
+          <w:left w:val="nil" w:color="FF000000" w:sz="0" w:space="0"/>
+          <w:bottom w:val="nil" w:color="FF000000" w:sz="0" w:space="0"/>
+          <w:right w:val="nil" w:color="FF000000" w:sz="0" w:space="0"/>
+          <w:between w:val="nil" w:color="FF000000" w:sz="0" w:space="0"/>
         </w:pBdr>
+        <w:spacing w:after="0" w:afterAutospacing="off"/>
+        <w:ind w:left="0"/>
         <w:rPr>
           <w:color w:val="000000"/>
-          <w:sz w:val="20"/>
-          <w:szCs w:val="20"/>
+          <w:sz w:val="22"/>
+          <w:szCs w:val="22"/>
         </w:rPr>
       </w:pPr>
     </w:p>
-    <w:p xmlns:wp14="http://schemas.microsoft.com/office/word/2010/wordml" wp14:textId="77777777">
-      <w:pPr>
-        <w:pBdr>
-          <w:top w:val="nil"/>
-          <w:left w:val="nil"/>
-          <w:bottom w:val="nil"/>
-          <w:right w:val="nil"/>
-          <w:between w:val="nil"/>
-        </w:pBdr>
-        <w:ind w:left="136"/>
-        <w:rPr>
-          <w:color w:val="000000"/>
-          <w:sz w:val="20"/>
-          <w:szCs w:val="20"/>
-        </w:rPr>
-      </w:pPr>
-    </w:p>
+    <w:tbl>
+      <w:tblPr>
+        <w:tblStyle w:val="TableGrid"/>
+        <w:tblW w:w="0" w:type="auto"/>
+        <w:tblBorders>
+          <w:top w:val="none" w:color="000000" w:themeColor="text1" w:sz="12"/>
+          <w:left w:val="none" w:color="000000" w:themeColor="text1" w:sz="12"/>
+          <w:bottom w:val="none" w:color="000000" w:themeColor="text1" w:sz="12"/>
+          <w:right w:val="none" w:color="000000" w:themeColor="text1" w:sz="12"/>
+          <w:insideH w:val="none" w:color="000000" w:themeColor="text1" w:sz="12"/>
+          <w:insideV w:val="none" w:color="000000" w:themeColor="text1" w:sz="12"/>
+        </w:tblBorders>
+        <w:tblLook w:val="06A0" w:firstRow="1" w:lastRow="0" w:firstColumn="1" w:lastColumn="0" w:noHBand="1" w:noVBand="1"/>
+      </w:tblPr>
+      <w:tblGrid>
+        <w:gridCol w:w="1740"/>
+        <w:gridCol w:w="4192"/>
+        <w:gridCol w:w="1393"/>
+        <w:gridCol w:w="2935"/>
+      </w:tblGrid>
+      <w:tr>
+        <w:trPr>
+          <w:trHeight w:val="567"/>
+        </w:trPr>
+        <w:tc>
+          <w:tcPr>
+            <w:tcW w:w="1740" w:type="dxa"/>
+            <w:tcMar/>
+            <w:vAlign w:val="center"/>
+          </w:tcPr>
+          <w:p>
+            <w:pPr>
+              <w:pStyle w:val="Normal"/>
+              <w:jc w:val="left"/>
+              <w:rPr>
+                <w:b w:val="1"/>
+                <w:bCs w:val="1"/>
+                <w:sz w:val="28"/>
+                <w:szCs w:val="28"/>
+              </w:rPr>
+            </w:pPr>
+            <w:r>
+              <w:rPr>
+                <w:b w:val="1"/>
+                <w:bCs w:val="1"/>
+                <w:sz w:val="28"/>
+                <w:szCs w:val="28"/>
+              </w:rPr>
+              <w:t>Consumidor:</w:t>
+            </w:r>
+          </w:p>
+        </w:tc>
+        <w:tc>
+          <w:tcPr>
+            <w:tcW w:w="4192" w:type="dxa"/>
+            <w:tcMar/>
+            <w:vAlign w:val="center"/>
+          </w:tcPr>
+          <w:p>
+            <w:pPr>
+              <w:pStyle w:val="Normal"/>
+              <w:spacing w:before="0" w:beforeAutospacing="off"/>
+              <w:jc w:val="left"/>
+              <w:rPr>
+                <w:color w:val="000000" w:themeColor="text1" w:themeTint="FF" w:themeShade="FF"/>
+                <w:sz w:val="22"/>
+                <w:szCs w:val="22"/>
+              </w:rPr>
+            </w:pPr>
+            <w:r>
+              <w:rPr>
+                <w:color w:val="000000" w:themeColor="text1" w:themeTint="FF" w:themeShade="FF"/>
+                <w:sz w:val="22"/>
+                <w:szCs w:val="22"/>
+              </w:rPr>
+              <w:t>$client</w:t>
+            </w:r>
+          </w:p>
+        </w:tc>
+        <w:tc>
+          <w:tcPr>
+            <w:tcW w:w="1393" w:type="dxa"/>
+            <w:tcMar/>
+            <w:vAlign w:val="center"/>
+          </w:tcPr>
+          <w:p>
+            <w:pPr>
+              <w:pStyle w:val="Normal"/>
+              <w:jc w:val="left"/>
+              <w:rPr>
+                <w:b w:val="1"/>
+                <w:bCs w:val="1"/>
+                <w:sz w:val="28"/>
+                <w:szCs w:val="28"/>
+              </w:rPr>
+            </w:pPr>
+            <w:r>
+              <w:rPr>
+                <w:b w:val="1"/>
+                <w:bCs w:val="1"/>
+                <w:sz w:val="28"/>
+                <w:szCs w:val="28"/>
+              </w:rPr>
+              <w:t>CPF:</w:t>
+            </w:r>
+          </w:p>
+        </w:tc>
+        <w:tc>
+          <w:tcPr>
+            <w:tcW w:w="2935" w:type="dxa"/>
+            <w:tcMar/>
+            <w:vAlign w:val="center"/>
+          </w:tcPr>
+          <w:p>
+            <w:pPr>
+              <w:pStyle w:val="Normal"/>
+              <w:spacing w:before="0" w:beforeAutospacing="off"/>
+              <w:jc w:val="left"/>
+              <w:rPr>
+                <w:color w:val="000000" w:themeColor="text1" w:themeTint="FF" w:themeShade="FF"/>
+                <w:sz w:val="22"/>
+                <w:szCs w:val="22"/>
+              </w:rPr>
+            </w:pPr>
+            <w:r>
+              <w:rPr>
+                <w:color w:val="000000" w:themeColor="text1" w:themeTint="FF" w:themeShade="FF"/>
+                <w:sz w:val="22"/>
+                <w:szCs w:val="22"/>
+              </w:rPr>
+              <w:t>$document</w:t>
+            </w:r>
+          </w:p>
+        </w:tc>
+      </w:tr>
+    </w:tbl>
     <w:p xmlns:wp14="http://schemas.microsoft.com/office/word/2010/wordml" wp14:textId="77777777">
       <w:pPr>
         <w:pBdr>
@@ -202,73 +513,22 @@
           <w:pgSz w:w="11910" w:h="16840" w:orient="portrait"/>
           <w:pgMar w:top="1500" w:right="1020" w:bottom="280" w:left="620" w:header="720" w:footer="720" w:gutter="0"/>
           <w:cols w:space="720"/>
+          <w:headerReference w:type="default" r:id="Rd070a71f4b7143b9"/>
+          <w:footerReference w:type="default" r:id="R332e71f9734a4b42"/>
         </w:sectPr>
       </w:pPr>
     </w:p>
-    <w:p xmlns:wp14="http://schemas.microsoft.com/office/word/2010/wordml" wp14:textId="77777777">
-      <w:pPr>
-        <w:pStyle w:val="Ttulo2"/>
-        <w:spacing w:before="44"/>
-        <w:ind w:firstLine="296"/>
-      </w:pPr>
-      <w:r>
-        <w:t>Consumidor:</w:t>
-      </w:r>
-    </w:p>
-    <w:p xmlns:wp14="http://schemas.microsoft.com/office/word/2010/wordml" wp14:textId="77777777">
+    <w:p xmlns:wp14="http://schemas.microsoft.com/office/word/2010/wordml" wp14:textId="3CBA32A0">
       <w:pPr>
         <w:pBdr>
-          <w:top w:val="nil"/>
-          <w:left w:val="nil"/>
-          <w:bottom w:val="nil"/>
-          <w:right w:val="nil"/>
-          <w:between w:val="nil"/>
+          <w:top w:val="nil" w:color="FF000000" w:sz="0" w:space="0"/>
+          <w:left w:val="nil" w:color="FF000000" w:sz="0" w:space="0"/>
+          <w:bottom w:val="nil" w:color="FF000000" w:sz="0" w:space="0"/>
+          <w:right w:val="nil" w:color="FF000000" w:sz="0" w:space="0"/>
+          <w:between w:val="nil" w:color="FF000000" w:sz="0" w:space="0"/>
         </w:pBdr>
-        <w:spacing w:before="82"/>
-        <w:ind w:left="164"/>
-        <w:rPr>
-          <w:color w:val="000000"/>
-        </w:rPr>
-      </w:pPr>
-      <w:r>
-        <w:br w:type="column"/>
-      </w:r>
-      <w:r>
-        <w:rPr>
-          <w:color w:val="000000"/>
-        </w:rPr>
-        <w:t>$client</w:t>
-      </w:r>
-    </w:p>
-    <w:p xmlns:wp14="http://schemas.microsoft.com/office/word/2010/wordml" wp14:textId="77777777">
-      <w:pPr>
-        <w:pStyle w:val="Ttulo1"/>
-        <w:ind w:firstLine="296"/>
-        <w:rPr>
-          <w:u w:val="none"/>
-        </w:rPr>
-      </w:pPr>
-      <w:r>
-        <w:br w:type="column"/>
-      </w:r>
-      <w:r>
-        <w:rPr>
-          <w:u w:val="none"/>
-        </w:rPr>
-        <w:t>CPF:</w:t>
-      </w:r>
-    </w:p>
-    <w:p xmlns:wp14="http://schemas.microsoft.com/office/word/2010/wordml" wp14:textId="77777777">
-      <w:pPr>
-        <w:pBdr>
-          <w:top w:val="nil"/>
-          <w:left w:val="nil"/>
-          <w:bottom w:val="nil"/>
-          <w:right w:val="nil"/>
-          <w:between w:val="nil"/>
-        </w:pBdr>
-        <w:spacing w:before="82"/>
-        <w:ind w:left="296"/>
+        <w:spacing w:before="0" w:beforeAutospacing="off"/>
+        <w:ind w:left="-567"/>
         <w:rPr>
           <w:color w:val="000000"/>
         </w:rPr>
@@ -282,166 +542,354 @@
             <w:col w:w="2537" w:space="40"/>
             <w:col w:w="2537"/>
           </w:cols>
+          <w:headerReference w:type="default" r:id="R051edceabe1847c1"/>
+          <w:footerReference w:type="default" r:id="R7251b5a69d0a4ced"/>
         </w:sectPr>
       </w:pPr>
+    </w:p>
+    <w:p xmlns:wp14="http://schemas.microsoft.com/office/word/2010/wordml" wp14:textId="31C23D26">
+      <w:pPr>
+        <w:pStyle w:val="Normal"/>
+        <w:pBdr>
+          <w:top w:val="nil" w:color="FF000000" w:sz="0" w:space="0"/>
+          <w:left w:val="nil" w:color="FF000000" w:sz="0" w:space="0"/>
+          <w:bottom w:val="nil" w:color="FF000000" w:sz="0" w:space="0"/>
+          <w:right w:val="nil" w:color="FF000000" w:sz="0" w:space="0"/>
+          <w:between w:val="nil" w:color="FF000000" w:sz="0" w:space="0"/>
+        </w:pBdr>
+        <w:spacing w:before="10"/>
+        <w:ind/>
+      </w:pPr>
+    </w:p>
+    <w:p xmlns:wp14="http://schemas.microsoft.com/office/word/2010/wordml" wp14:textId="77F71397">
+      <w:pPr>
+        <w:pStyle w:val="Normal"/>
+        <w:pBdr>
+          <w:top w:val="nil" w:color="FF000000" w:sz="0" w:space="0"/>
+          <w:left w:val="nil" w:color="FF000000" w:sz="0" w:space="0"/>
+          <w:bottom w:val="nil" w:color="FF000000" w:sz="0" w:space="0"/>
+          <w:right w:val="nil" w:color="FF000000" w:sz="0" w:space="0"/>
+          <w:between w:val="nil" w:color="FF000000" w:sz="0" w:space="0"/>
+        </w:pBdr>
+        <w:spacing w:before="0" w:beforeAutospacing="off"/>
+        <w:ind/>
+      </w:pPr>
       <w:r>
-        <w:br w:type="column"/>
-      </w:r>
-      <w:r>
-        <w:rPr>
-          <w:color w:val="000000"/>
-        </w:rPr>
-        <w:t>$document</w:t>
+        <w:drawing>
+          <wp:inline xmlns:wp14="http://schemas.microsoft.com/office/word/2010/wordprocessingDrawing" wp14:editId="45197B95" wp14:anchorId="5F96ACEE">
+            <wp:extent cx="6477120" cy="203622"/>
+            <wp:effectExtent l="0" t="0" r="0" b="0"/>
+            <wp:docPr id="1817798386" name="drawing" title="Textbox 3, Caixa de texto"/>
+            <wp:cNvGraphicFramePr>
+              <a:graphicFrameLocks noChangeAspect="1"/>
+            </wp:cNvGraphicFramePr>
+            <a:graphic>
+              <a:graphicData xmlns:a="http://schemas.openxmlformats.org/drawingml/2006/main" uri="http://schemas.openxmlformats.org/drawingml/2006/picture">
+                <pic:pic xmlns:pic="http://schemas.openxmlformats.org/drawingml/2006/picture">
+                  <pic:nvPicPr>
+                    <pic:cNvPr id="1817798386" name="Picture 1817798386"/>
+                    <pic:cNvPicPr/>
+                  </pic:nvPicPr>
+                  <pic:blipFill>
+                    <a:blip xmlns:r="http://schemas.openxmlformats.org/officeDocument/2006/relationships" r:embed="rId1155375488">
+                      <a:extLst>
+                        <a:ext uri="{28A0092B-C50C-407E-A947-70E740481C1C}">
+                          <a14:useLocalDpi xmlns:a14="http://schemas.microsoft.com/office/drawing/2010/main"/>
+                        </a:ext>
+                      </a:extLst>
+                    </a:blip>
+                    <a:stretch>
+                      <a:fillRect/>
+                    </a:stretch>
+                  </pic:blipFill>
+                  <pic:spPr>
+                    <a:xfrm rot="0">
+                      <a:off x="0" y="0"/>
+                      <a:ext cx="6477120" cy="203622"/>
+                    </a:xfrm>
+                    <a:prstGeom prst="rect">
+                      <a:avLst/>
+                    </a:prstGeom>
+                  </pic:spPr>
+                </pic:pic>
+              </a:graphicData>
+            </a:graphic>
+          </wp:inline>
+        </w:drawing>
       </w:r>
     </w:p>
-    <w:p xmlns:wp14="http://schemas.microsoft.com/office/word/2010/wordml" wp14:textId="77777777">
+    <w:p>
       <w:pPr>
-        <w:pBdr>
-          <w:top w:val="nil"/>
-          <w:left w:val="nil"/>
-          <w:bottom w:val="nil"/>
-          <w:right w:val="nil"/>
-          <w:between w:val="nil"/>
-        </w:pBdr>
-        <w:spacing w:before="10"/>
+        <w:pStyle w:val="Normal"/>
+        <w:tabs>
+          <w:tab w:val="left" w:leader="none" w:pos="1993"/>
+          <w:tab w:val="left" w:leader="none" w:pos="8230"/>
+        </w:tabs>
         <w:rPr>
-          <w:color w:val="000000"/>
-          <w:sz w:val="20"/>
-          <w:szCs w:val="20"/>
+          <w:b w:val="0"/>
+          <w:bCs w:val="0"/>
+          <w:sz w:val="22"/>
+          <w:szCs w:val="22"/>
         </w:rPr>
       </w:pPr>
     </w:p>
-    <w:p xmlns:wp14="http://schemas.microsoft.com/office/word/2010/wordml" wp14:textId="77777777">
+    <w:tbl>
+      <w:tblPr>
+        <w:tblStyle w:val="TableGrid"/>
+        <w:tblW w:w="0" w:type="auto"/>
+        <w:tblBorders>
+          <w:top w:val="none" w:color="000000" w:themeColor="text1" w:sz="12"/>
+          <w:left w:val="none" w:color="000000" w:themeColor="text1" w:sz="12"/>
+          <w:bottom w:val="none" w:color="000000" w:themeColor="text1" w:sz="12"/>
+          <w:right w:val="none" w:color="000000" w:themeColor="text1" w:sz="12"/>
+          <w:insideH w:val="none" w:color="000000" w:themeColor="text1" w:sz="12"/>
+          <w:insideV w:val="none" w:color="000000" w:themeColor="text1" w:sz="12"/>
+        </w:tblBorders>
+        <w:tblLook w:val="06A0" w:firstRow="1" w:lastRow="0" w:firstColumn="1" w:lastColumn="0" w:noHBand="1" w:noVBand="1"/>
+      </w:tblPr>
+      <w:tblGrid>
+        <w:gridCol w:w="1721"/>
+        <w:gridCol w:w="4224"/>
+        <w:gridCol w:w="1602"/>
+        <w:gridCol w:w="2713"/>
+      </w:tblGrid>
+      <w:tr>
+        <w:trPr>
+          <w:trHeight w:val="567"/>
+        </w:trPr>
+        <w:tc>
+          <w:tcPr>
+            <w:tcW w:w="1721" w:type="dxa"/>
+            <w:tcMar/>
+            <w:vAlign w:val="center"/>
+          </w:tcPr>
+          <w:p>
+            <w:pPr>
+              <w:pStyle w:val="Normal"/>
+              <w:jc w:val="left"/>
+            </w:pPr>
+            <w:r>
+              <w:rPr>
+                <w:b w:val="1"/>
+                <w:bCs w:val="1"/>
+                <w:sz w:val="28"/>
+                <w:szCs w:val="28"/>
+              </w:rPr>
+              <w:t>Produto:</w:t>
+            </w:r>
+          </w:p>
+        </w:tc>
+        <w:tc>
+          <w:tcPr>
+            <w:tcW w:w="4224" w:type="dxa"/>
+            <w:tcMar/>
+            <w:vAlign w:val="center"/>
+          </w:tcPr>
+          <w:p>
+            <w:pPr>
+              <w:pStyle w:val="Normal"/>
+              <w:spacing w:before="0" w:beforeAutospacing="off"/>
+              <w:jc w:val="left"/>
+              <w:rPr>
+                <w:b w:val="0"/>
+                <w:bCs w:val="0"/>
+                <w:sz w:val="22"/>
+                <w:szCs w:val="22"/>
+              </w:rPr>
+            </w:pPr>
+            <w:r>
+              <w:rPr>
+                <w:b w:val="0"/>
+                <w:bCs w:val="0"/>
+                <w:sz w:val="22"/>
+                <w:szCs w:val="22"/>
+              </w:rPr>
+              <w:t>$product</w:t>
+            </w:r>
+          </w:p>
+        </w:tc>
+        <w:tc>
+          <w:tcPr>
+            <w:tcW w:w="1602" w:type="dxa"/>
+            <w:tcMar/>
+            <w:vAlign w:val="center"/>
+          </w:tcPr>
+          <w:p>
+            <w:pPr>
+              <w:pStyle w:val="Normal"/>
+              <w:jc w:val="left"/>
+            </w:pPr>
+            <w:r>
+              <w:rPr>
+                <w:b w:val="1"/>
+                <w:bCs w:val="1"/>
+                <w:sz w:val="28"/>
+                <w:szCs w:val="28"/>
+              </w:rPr>
+              <w:t>N° de Série:</w:t>
+            </w:r>
+          </w:p>
+        </w:tc>
+        <w:tc>
+          <w:tcPr>
+            <w:tcW w:w="2713" w:type="dxa"/>
+            <w:tcMar/>
+            <w:vAlign w:val="center"/>
+          </w:tcPr>
+          <w:p>
+            <w:pPr>
+              <w:pStyle w:val="Normal"/>
+              <w:spacing w:before="0" w:beforeAutospacing="off"/>
+              <w:jc w:val="left"/>
+              <w:rPr>
+                <w:b w:val="0"/>
+                <w:bCs w:val="0"/>
+                <w:sz w:val="22"/>
+                <w:szCs w:val="22"/>
+              </w:rPr>
+            </w:pPr>
+            <w:r>
+              <w:rPr>
+                <w:b w:val="0"/>
+                <w:bCs w:val="0"/>
+                <w:sz w:val="22"/>
+                <w:szCs w:val="22"/>
+              </w:rPr>
+              <w:t>$serial_number</w:t>
+            </w:r>
+          </w:p>
+        </w:tc>
+      </w:tr>
+      <w:tr>
+        <w:trPr>
+          <w:trHeight w:val="567"/>
+        </w:trPr>
+        <w:tc>
+          <w:tcPr>
+            <w:tcW w:w="1721" w:type="dxa"/>
+            <w:tcMar/>
+            <w:vAlign w:val="center"/>
+          </w:tcPr>
+          <w:p>
+            <w:pPr>
+              <w:pStyle w:val="Normal"/>
+              <w:jc w:val="left"/>
+              <w:rPr>
+                <w:lang w:val="it-IT"/>
+              </w:rPr>
+            </w:pPr>
+            <w:r>
+              <w:rPr>
+                <w:b w:val="1"/>
+                <w:bCs w:val="1"/>
+                <w:sz w:val="28"/>
+                <w:szCs w:val="28"/>
+                <w:lang w:val="it-IT"/>
+              </w:rPr>
+              <w:t>Marca:</w:t>
+            </w:r>
+          </w:p>
+        </w:tc>
+        <w:tc>
+          <w:tcPr>
+            <w:tcW w:w="4224" w:type="dxa"/>
+            <w:tcMar/>
+            <w:vAlign w:val="center"/>
+          </w:tcPr>
+          <w:p>
+            <w:pPr>
+              <w:pStyle w:val="Normal"/>
+              <w:spacing w:before="0" w:beforeAutospacing="off"/>
+              <w:jc w:val="left"/>
+              <w:rPr>
+                <w:b w:val="0"/>
+                <w:bCs w:val="0"/>
+                <w:sz w:val="22"/>
+                <w:szCs w:val="22"/>
+              </w:rPr>
+            </w:pPr>
+            <w:r>
+              <w:rPr>
+                <w:b w:val="0"/>
+                <w:bCs w:val="0"/>
+                <w:sz w:val="22"/>
+                <w:szCs w:val="22"/>
+              </w:rPr>
+              <w:t>$brand</w:t>
+            </w:r>
+          </w:p>
+        </w:tc>
+        <w:tc>
+          <w:tcPr>
+            <w:tcW w:w="1602" w:type="dxa"/>
+            <w:tcMar/>
+            <w:vAlign w:val="center"/>
+          </w:tcPr>
+          <w:p>
+            <w:pPr>
+              <w:pStyle w:val="Normal"/>
+              <w:jc w:val="left"/>
+              <w:rPr>
+                <w:lang w:val="it-IT"/>
+              </w:rPr>
+            </w:pPr>
+            <w:r>
+              <w:rPr>
+                <w:b w:val="1"/>
+                <w:bCs w:val="1"/>
+                <w:sz w:val="28"/>
+                <w:szCs w:val="28"/>
+                <w:lang w:val="it-IT"/>
+              </w:rPr>
+              <w:t>Sinistro:</w:t>
+            </w:r>
+          </w:p>
+        </w:tc>
+        <w:tc>
+          <w:tcPr>
+            <w:tcW w:w="2713" w:type="dxa"/>
+            <w:tcMar/>
+            <w:vAlign w:val="center"/>
+          </w:tcPr>
+          <w:p>
+            <w:pPr>
+              <w:pStyle w:val="Normal"/>
+              <w:spacing w:before="0" w:beforeAutospacing="off"/>
+              <w:jc w:val="left"/>
+              <w:rPr>
+                <w:b w:val="0"/>
+                <w:bCs w:val="0"/>
+                <w:sz w:val="22"/>
+                <w:szCs w:val="22"/>
+              </w:rPr>
+            </w:pPr>
+            <w:r>
+              <w:rPr>
+                <w:b w:val="0"/>
+                <w:bCs w:val="0"/>
+                <w:sz w:val="22"/>
+                <w:szCs w:val="22"/>
+              </w:rPr>
+              <w:t>$claim</w:t>
+            </w:r>
+          </w:p>
+        </w:tc>
+      </w:tr>
+    </w:tbl>
+    <w:p xmlns:wp14="http://schemas.microsoft.com/office/word/2010/wordml" wp14:textId="294927DB">
       <w:pPr>
-        <w:pBdr>
-          <w:top w:val="nil"/>
-          <w:left w:val="nil"/>
-          <w:bottom w:val="nil"/>
-          <w:right w:val="nil"/>
-          <w:between w:val="nil"/>
-        </w:pBdr>
-        <w:ind w:left="136"/>
-        <w:rPr>
-          <w:color w:val="000000"/>
-          <w:sz w:val="20"/>
-          <w:szCs w:val="20"/>
-        </w:rPr>
-      </w:pPr>
-    </w:p>
-    <w:p xmlns:wp14="http://schemas.microsoft.com/office/word/2010/wordml" wp14:textId="77777777">
-      <w:pPr>
+        <w:pStyle w:val="Normal"/>
         <w:tabs>
-          <w:tab w:val="left" w:pos="1993"/>
-          <w:tab w:val="left" w:pos="8230"/>
+          <w:tab w:val="left" w:leader="none" w:pos="1993"/>
+          <w:tab w:val="left" w:leader="none" w:pos="8230"/>
         </w:tabs>
-        <w:spacing w:before="251"/>
-        <w:ind w:left="296"/>
-      </w:pPr>
-      <w:r>
-        <w:rPr>
-          <w:b/>
-          <w:bCs/>
-          <w:sz w:val="28"/>
-          <w:szCs w:val="28"/>
-        </w:rPr>
-        <w:t>Produto:</w:t>
-      </w:r>
-      <w:r>
-        <w:rPr>
-          <w:b/>
-          <w:bCs/>
-          <w:sz w:val="28"/>
-          <w:szCs w:val="28"/>
-        </w:rPr>
-        <w:tab/>
-      </w:r>
-      <w:r>
-        <w:t xml:space="preserve">$model                                                                         </w:t>
-      </w:r>
-      <w:r>
-        <w:rPr>
-          <w:b/>
-          <w:bCs/>
-          <w:sz w:val="28"/>
-          <w:szCs w:val="28"/>
-        </w:rPr>
-        <w:t>N° de Série:</w:t>
-      </w:r>
-      <w:r>
-        <w:t xml:space="preserve"> $serial_number</w:t>
-      </w:r>
-    </w:p>
-    <w:p xmlns:wp14="http://schemas.microsoft.com/office/word/2010/wordml" wp14:textId="77777777">
-      <w:pPr>
-        <w:tabs>
-          <w:tab w:val="left" w:pos="1993"/>
-          <w:tab w:val="left" w:pos="8230"/>
-        </w:tabs>
-        <w:spacing w:before="251"/>
-        <w:ind w:left="296"/>
         <w:sectPr>
           <w:type w:val="continuous"/>
           <w:pgSz w:w="11910" w:h="16840" w:orient="portrait"/>
           <w:pgMar w:top="1500" w:right="1020" w:bottom="280" w:left="620" w:header="720" w:footer="720" w:gutter="0"/>
           <w:cols w:space="720"/>
-        </w:sectPr>
-      </w:pPr>
-      <w:r>
-        <w:rPr>
-          <w:b/>
-          <w:bCs/>
-          <w:sz w:val="28"/>
-          <w:szCs w:val="28"/>
-        </w:rPr>
-        <w:t>Marca:</w:t>
-      </w:r>
-      <w:r>
-        <w:rPr>
-          <w:b/>
-          <w:bCs/>
-          <w:sz w:val="28"/>
-          <w:szCs w:val="28"/>
-        </w:rPr>
-        <w:tab/>
-      </w:r>
-      <w:r>
-        <w:t xml:space="preserve">$brand                                                                          </w:t>
-      </w:r>
-      <w:r>
-        <w:rPr>
-          <w:b/>
-          <w:bCs/>
-          <w:sz w:val="28"/>
-          <w:szCs w:val="28"/>
-        </w:rPr>
-        <w:t xml:space="preserve">Sinistro:       </w:t>
-      </w:r>
-      <w:r>
-        <w:t>$claim</w:t>
-      </w:r>
-    </w:p>
-    <w:p xmlns:wp14="http://schemas.microsoft.com/office/word/2010/wordml" wp14:textId="77777777">
-      <w:pPr>
-        <w:sectPr>
-          <w:type w:val="continuous"/>
-          <w:pgSz w:w="11910" w:h="16840" w:orient="portrait"/>
-          <w:pgMar w:top="1500" w:right="1020" w:bottom="280" w:left="620" w:header="720" w:footer="720" w:gutter="0"/>
-          <w:cols w:equalWidth="0" w:space="720" w:num="4">
-            <w:col w:w="2161" w:space="542"/>
-            <w:col w:w="2161" w:space="542"/>
-            <w:col w:w="2161" w:space="542"/>
-            <w:col w:w="2161"/>
-          </w:cols>
-        </w:sectPr>
-      </w:pPr>
-    </w:p>
-    <w:p xmlns:wp14="http://schemas.microsoft.com/office/word/2010/wordml" wp14:textId="77777777">
-      <w:pPr>
-        <w:sectPr>
-          <w:type w:val="continuous"/>
-          <w:pgSz w:w="11910" w:h="16840" w:orient="portrait"/>
-          <w:pgMar w:top="1500" w:right="1020" w:bottom="280" w:left="620" w:header="720" w:footer="720" w:gutter="0"/>
-          <w:cols w:space="720"/>
+          <w:headerReference w:type="default" r:id="R79840bbd380f4bcb"/>
+          <w:footerReference w:type="default" r:id="Rc332a5f3af914d62"/>
         </w:sectPr>
       </w:pPr>
     </w:p>
@@ -457,58 +905,82 @@
             <w:col w:w="2161" w:space="542"/>
             <w:col w:w="2161"/>
           </w:cols>
+          <w:headerReference w:type="default" r:id="R0072aec4585e457f"/>
+          <w:footerReference w:type="default" r:id="R60196629fec94ded"/>
         </w:sectPr>
       </w:pPr>
     </w:p>
-    <w:p xmlns:wp14="http://schemas.microsoft.com/office/word/2010/wordml" wp14:textId="77777777">
+    <w:p xmlns:wp14="http://schemas.microsoft.com/office/word/2010/wordml" wp14:textId="20E1E202">
       <w:pPr>
-        <w:pBdr>
-          <w:top w:val="nil"/>
-          <w:left w:val="nil"/>
-          <w:bottom w:val="nil"/>
-          <w:right w:val="nil"/>
-          <w:between w:val="nil"/>
-        </w:pBdr>
-        <w:spacing w:before="21"/>
-        <w:rPr>
-          <w:color w:val="000000"/>
-          <w:sz w:val="20"/>
-          <w:szCs w:val="20"/>
-        </w:rPr>
+        <w:pStyle w:val="Normal"/>
+        <w:sectPr>
+          <w:type w:val="continuous"/>
+          <w:pgSz w:w="11910" w:h="16840" w:orient="portrait"/>
+          <w:pgMar w:top="1500" w:right="1020" w:bottom="280" w:left="620" w:header="720" w:footer="720" w:gutter="0"/>
+          <w:cols w:space="720"/>
+          <w:headerReference w:type="default" r:id="R40c2978b96594e89"/>
+          <w:footerReference w:type="default" r:id="R7118ee79ae2342b9"/>
+        </w:sectPr>
       </w:pPr>
+      <w:r>
+        <w:drawing>
+          <wp:inline xmlns:wp14="http://schemas.microsoft.com/office/word/2010/wordprocessingDrawing" wp14:editId="242AF9CC" wp14:anchorId="60C9D3EA">
+            <wp:extent cx="6477120" cy="419108"/>
+            <wp:effectExtent l="0" t="0" r="0" b="0"/>
+            <wp:docPr id="897230775" name="drawing" title="Textbox 4, Caixa de texto"/>
+            <wp:cNvGraphicFramePr>
+              <a:graphicFrameLocks noChangeAspect="1"/>
+            </wp:cNvGraphicFramePr>
+            <a:graphic>
+              <a:graphicData xmlns:a="http://schemas.openxmlformats.org/drawingml/2006/main" uri="http://schemas.openxmlformats.org/drawingml/2006/picture">
+                <pic:pic xmlns:pic="http://schemas.openxmlformats.org/drawingml/2006/picture">
+                  <pic:nvPicPr>
+                    <pic:cNvPr id="70280346" name="Picture 70280346"/>
+                    <pic:cNvPicPr/>
+                  </pic:nvPicPr>
+                  <pic:blipFill>
+                    <a:blip xmlns:r="http://schemas.openxmlformats.org/officeDocument/2006/relationships" r:embed="rId721802578">
+                      <a:extLst>
+                        <a:ext uri="{28A0092B-C50C-407E-A947-70E740481C1C}">
+                          <a14:useLocalDpi xmlns:a14="http://schemas.microsoft.com/office/drawing/2010/main"/>
+                        </a:ext>
+                      </a:extLst>
+                    </a:blip>
+                    <a:stretch>
+                      <a:fillRect/>
+                    </a:stretch>
+                  </pic:blipFill>
+                  <pic:spPr>
+                    <a:xfrm rot="0">
+                      <a:off x="0" y="0"/>
+                      <a:ext cx="6477120" cy="419108"/>
+                    </a:xfrm>
+                    <a:prstGeom prst="rect">
+                      <a:avLst/>
+                    </a:prstGeom>
+                  </pic:spPr>
+                </pic:pic>
+              </a:graphicData>
+            </a:graphic>
+          </wp:inline>
+        </w:drawing>
+      </w:r>
     </w:p>
     <w:p xmlns:wp14="http://schemas.microsoft.com/office/word/2010/wordml" wp14:textId="77777777">
       <w:pPr>
-        <w:pBdr>
-          <w:top w:val="nil"/>
-          <w:left w:val="nil"/>
-          <w:bottom w:val="nil"/>
-          <w:right w:val="nil"/>
-          <w:between w:val="nil"/>
-        </w:pBdr>
-        <w:ind w:left="136"/>
-        <w:rPr>
-          <w:color w:val="000000"/>
-          <w:sz w:val="20"/>
-          <w:szCs w:val="20"/>
-        </w:rPr>
-      </w:pPr>
-    </w:p>
-    <w:p xmlns:wp14="http://schemas.microsoft.com/office/word/2010/wordml" wp14:textId="77777777">
-      <w:pPr>
-        <w:pBdr>
-          <w:top w:val="nil"/>
-          <w:left w:val="nil"/>
-          <w:bottom w:val="nil"/>
-          <w:right w:val="nil"/>
-          <w:between w:val="nil"/>
-        </w:pBdr>
-        <w:spacing w:before="8"/>
-        <w:rPr>
-          <w:color w:val="000000"/>
-          <w:sz w:val="18"/>
-          <w:szCs w:val="18"/>
-        </w:rPr>
+        <w:sectPr>
+          <w:type w:val="continuous"/>
+          <w:pgSz w:w="11910" w:h="16840" w:orient="portrait"/>
+          <w:pgMar w:top="1500" w:right="1020" w:bottom="280" w:left="620" w:header="720" w:footer="720" w:gutter="0"/>
+          <w:cols w:equalWidth="0" w:space="720" w:num="4">
+            <w:col w:w="2161" w:space="542"/>
+            <w:col w:w="2161" w:space="542"/>
+            <w:col w:w="2161" w:space="542"/>
+            <w:col w:w="2161"/>
+          </w:cols>
+          <w:headerReference w:type="default" r:id="Re0e3c712d105407f"/>
+          <w:footerReference w:type="default" r:id="R9548e877dcbf45fe"/>
+        </w:sectPr>
       </w:pPr>
     </w:p>
     <w:tbl>
@@ -541,21 +1013,24 @@
               <w:bottom w:val="nil"/>
             </w:tcBorders>
             <w:shd w:val="clear" w:color="auto" w:fill="BEBEBE"/>
+            <w:tcMar/>
+            <w:vAlign w:val="top"/>
           </w:tcPr>
           <w:p wp14:textId="77777777">
             <w:pPr>
               <w:pBdr>
-                <w:top w:val="nil"/>
-                <w:left w:val="nil"/>
-                <w:bottom w:val="nil"/>
-                <w:right w:val="nil"/>
-                <w:between w:val="nil"/>
+                <w:top w:val="nil" w:color="FF000000" w:sz="0" w:space="0"/>
+                <w:left w:val="nil" w:color="FF000000" w:sz="0" w:space="0"/>
+                <w:bottom w:val="nil" w:color="FF000000" w:sz="0" w:space="0"/>
+                <w:right w:val="nil" w:color="FF000000" w:sz="0" w:space="0"/>
+                <w:between w:val="nil" w:color="FF000000" w:sz="0" w:space="0"/>
               </w:pBdr>
               <w:spacing w:line="250" w:lineRule="auto"/>
               <w:ind w:left="37"/>
-              <w:rPr>
-                <w:b/>
-                <w:bCs/>
+              <w:jc w:val="left"/>
+              <w:rPr>
+                <w:b w:val="1"/>
+                <w:bCs w:val="1"/>
                 <w:color w:val="000000"/>
                 <w:sz w:val="24"/>
                 <w:szCs w:val="24"/>
@@ -563,9 +1038,9 @@
             </w:pPr>
             <w:r>
               <w:rPr>
-                <w:b/>
-                <w:bCs/>
-                <w:color w:val="000000"/>
+                <w:b w:val="1"/>
+                <w:bCs w:val="1"/>
+                <w:color w:val="000000" w:themeColor="text1" w:themeTint="FF" w:themeShade="FF"/>
                 <w:sz w:val="24"/>
                 <w:szCs w:val="24"/>
                 <w:u w:val="single"/>
@@ -577,7 +1052,7 @@
       </w:tr>
       <w:tr xmlns:wp14="http://schemas.microsoft.com/office/word/2010/wordml" wp14:textId="77777777">
         <w:trPr>
-          <w:trHeight w:val="2266"/>
+          <w:trHeight w:val="2040"/>
         </w:trPr>
         <w:tc>
           <w:tcPr>
@@ -586,40 +1061,32 @@
               <w:top w:val="nil"/>
               <w:bottom w:val="nil"/>
             </w:tcBorders>
+            <w:tcMar/>
+            <w:vAlign w:val="top"/>
           </w:tcPr>
-          <w:p wp14:textId="77777777">
+          <w:p wp14:textId="7DB1E1F0">
             <w:pPr>
               <w:pBdr>
-                <w:top w:val="nil"/>
-                <w:left w:val="nil"/>
-                <w:bottom w:val="nil"/>
-                <w:right w:val="nil"/>
-                <w:between w:val="nil"/>
+                <w:top w:val="nil" w:color="FF000000" w:sz="0" w:space="0"/>
+                <w:left w:val="nil" w:color="FF000000" w:sz="0" w:space="0"/>
+                <w:bottom w:val="nil" w:color="FF000000" w:sz="0" w:space="0"/>
+                <w:right w:val="nil" w:color="FF000000" w:sz="0" w:space="0"/>
+                <w:between w:val="nil" w:color="FF000000" w:sz="0" w:space="0"/>
               </w:pBdr>
-              <w:spacing w:before="30"/>
+              <w:spacing w:before="240" w:beforeAutospacing="off" w:line="259" w:lineRule="auto"/>
+              <w:ind w:left="35"/>
+              <w:jc w:val="left"/>
               <w:rPr>
                 <w:color w:val="000000"/>
-              </w:rPr>
-            </w:pPr>
-          </w:p>
-          <w:p wp14:textId="77777777">
-            <w:pPr>
-              <w:pBdr>
-                <w:top w:val="nil"/>
-                <w:left w:val="nil"/>
-                <w:bottom w:val="nil"/>
-                <w:right w:val="nil"/>
-                <w:between w:val="nil"/>
-              </w:pBdr>
-              <w:spacing w:line="259" w:lineRule="auto"/>
-              <w:ind w:left="35"/>
-              <w:rPr>
-                <w:color w:val="000000"/>
+                <w:sz w:val="24"/>
+                <w:szCs w:val="24"/>
               </w:rPr>
             </w:pPr>
             <w:r>
               <w:rPr>
-                <w:color w:val="000000"/>
+                <w:color w:val="000000" w:themeColor="text1" w:themeTint="FF" w:themeShade="FF"/>
+                <w:sz w:val="24"/>
+                <w:szCs w:val="24"/>
               </w:rPr>
               <w:t>$resolution</w:t>
             </w:r>
@@ -638,21 +1105,24 @@
               <w:bottom w:val="nil"/>
             </w:tcBorders>
             <w:shd w:val="clear" w:color="auto" w:fill="BEBEBE"/>
+            <w:tcMar/>
+            <w:vAlign w:val="top"/>
           </w:tcPr>
           <w:p wp14:textId="77777777">
             <w:pPr>
               <w:pBdr>
-                <w:top w:val="nil"/>
-                <w:left w:val="nil"/>
-                <w:bottom w:val="nil"/>
-                <w:right w:val="nil"/>
-                <w:between w:val="nil"/>
+                <w:top w:val="nil" w:color="FF000000" w:sz="0" w:space="0"/>
+                <w:left w:val="nil" w:color="FF000000" w:sz="0" w:space="0"/>
+                <w:bottom w:val="nil" w:color="FF000000" w:sz="0" w:space="0"/>
+                <w:right w:val="nil" w:color="FF000000" w:sz="0" w:space="0"/>
+                <w:between w:val="nil" w:color="FF000000" w:sz="0" w:space="0"/>
               </w:pBdr>
               <w:spacing w:line="273" w:lineRule="auto"/>
               <w:ind w:left="37"/>
-              <w:rPr>
-                <w:b/>
-                <w:bCs/>
+              <w:jc w:val="left"/>
+              <w:rPr>
+                <w:b w:val="1"/>
+                <w:bCs w:val="1"/>
                 <w:color w:val="000000"/>
                 <w:sz w:val="24"/>
                 <w:szCs w:val="24"/>
@@ -660,9 +1130,9 @@
             </w:pPr>
             <w:r>
               <w:rPr>
-                <w:b/>
-                <w:bCs/>
-                <w:color w:val="000000"/>
+                <w:b w:val="1"/>
+                <w:bCs w:val="1"/>
+                <w:color w:val="000000" w:themeColor="text1" w:themeTint="FF" w:themeShade="FF"/>
                 <w:sz w:val="24"/>
                 <w:szCs w:val="24"/>
                 <w:u w:val="single"/>
@@ -674,7 +1144,7 @@
       </w:tr>
       <w:tr xmlns:wp14="http://schemas.microsoft.com/office/word/2010/wordml" wp14:textId="77777777">
         <w:trPr>
-          <w:trHeight w:val="2118"/>
+          <w:trHeight w:val="1440"/>
         </w:trPr>
         <w:tc>
           <w:tcPr>
@@ -682,18 +1152,21 @@
             <w:tcBorders>
               <w:top w:val="nil"/>
             </w:tcBorders>
+            <w:tcMar/>
+            <w:vAlign w:val="top"/>
           </w:tcPr>
-          <w:p wp14:textId="77777777">
+          <w:p wp14:textId="1CC3898B">
             <w:pPr>
               <w:pBdr>
-                <w:top w:val="nil"/>
-                <w:left w:val="nil"/>
-                <w:bottom w:val="nil"/>
-                <w:right w:val="nil"/>
-                <w:between w:val="nil"/>
+                <w:top w:val="nil" w:color="FF000000" w:sz="0" w:space="0"/>
+                <w:left w:val="nil" w:color="FF000000" w:sz="0" w:space="0"/>
+                <w:bottom w:val="nil" w:color="FF000000" w:sz="0" w:space="0"/>
+                <w:right w:val="nil" w:color="FF000000" w:sz="0" w:space="0"/>
+                <w:between w:val="nil" w:color="FF000000" w:sz="0" w:space="0"/>
               </w:pBdr>
-              <w:spacing w:before="263" w:line="254" w:lineRule="auto"/>
+              <w:spacing w:before="240" w:beforeAutospacing="off" w:line="254" w:lineRule="auto"/>
               <w:ind w:left="37"/>
+              <w:jc w:val="left"/>
               <w:rPr>
                 <w:color w:val="000000"/>
                 <w:sz w:val="24"/>
@@ -702,11 +1175,43 @@
             </w:pPr>
             <w:r>
               <w:rPr>
-                <w:color w:val="000000"/>
+                <w:color w:val="000000" w:themeColor="text1" w:themeTint="FF" w:themeShade="FF"/>
                 <w:sz w:val="24"/>
                 <w:szCs w:val="24"/>
               </w:rPr>
-              <w:t>Danos esteticos como descascamento, rasgos no tecido/couro, pés ou estrutura descascadadas não são danos funcionais do produto. Esses danos não afetam a utilização do produto e não possui cobertura.</w:t>
+              <w:t xml:space="preserve">Danos </w:t>
+            </w:r>
+            <w:r>
+              <w:rPr>
+                <w:color w:val="000000" w:themeColor="text1" w:themeTint="FF" w:themeShade="FF"/>
+                <w:sz w:val="24"/>
+                <w:szCs w:val="24"/>
+              </w:rPr>
+              <w:t>estéticos</w:t>
+            </w:r>
+            <w:r>
+              <w:rPr>
+                <w:color w:val="000000" w:themeColor="text1" w:themeTint="FF" w:themeShade="FF"/>
+                <w:sz w:val="24"/>
+                <w:szCs w:val="24"/>
+              </w:rPr>
+              <w:t xml:space="preserve"> como descascamento, rasgos no tecido/couro, pés ou estrutura </w:t>
+            </w:r>
+            <w:r>
+              <w:rPr>
+                <w:color w:val="000000" w:themeColor="text1" w:themeTint="FF" w:themeShade="FF"/>
+                <w:sz w:val="24"/>
+                <w:szCs w:val="24"/>
+              </w:rPr>
+              <w:t>descascadas</w:t>
+            </w:r>
+            <w:r>
+              <w:rPr>
+                <w:color w:val="000000" w:themeColor="text1" w:themeTint="FF" w:themeShade="FF"/>
+                <w:sz w:val="24"/>
+                <w:szCs w:val="24"/>
+              </w:rPr>
+              <w:t xml:space="preserve"> não são danos funcionais do produto. Esses danos não afetam a utilização do produto e não possui cobertura.</w:t>
             </w:r>
           </w:p>
         </w:tc>
@@ -722,21 +1227,24 @@
               <w:bottom w:val="nil"/>
             </w:tcBorders>
             <w:shd w:val="clear" w:color="auto" w:fill="C8C8C8"/>
+            <w:tcMar/>
+            <w:vAlign w:val="top"/>
           </w:tcPr>
           <w:p wp14:textId="77777777">
             <w:pPr>
               <w:pBdr>
-                <w:top w:val="nil"/>
-                <w:left w:val="nil"/>
-                <w:bottom w:val="nil"/>
-                <w:right w:val="nil"/>
-                <w:between w:val="nil"/>
+                <w:top w:val="nil" w:color="FF000000" w:sz="0" w:space="0"/>
+                <w:left w:val="nil" w:color="FF000000" w:sz="0" w:space="0"/>
+                <w:bottom w:val="nil" w:color="FF000000" w:sz="0" w:space="0"/>
+                <w:right w:val="nil" w:color="FF000000" w:sz="0" w:space="0"/>
+                <w:between w:val="nil" w:color="FF000000" w:sz="0" w:space="0"/>
               </w:pBdr>
               <w:spacing w:line="202" w:lineRule="auto"/>
               <w:ind w:left="37"/>
-              <w:rPr>
-                <w:b/>
-                <w:bCs/>
+              <w:jc w:val="left"/>
+              <w:rPr>
+                <w:b w:val="1"/>
+                <w:bCs w:val="1"/>
                 <w:color w:val="000000"/>
                 <w:sz w:val="24"/>
                 <w:szCs w:val="24"/>
@@ -744,9 +1252,9 @@
             </w:pPr>
             <w:r>
               <w:rPr>
-                <w:b/>
-                <w:bCs/>
-                <w:color w:val="000000"/>
+                <w:b w:val="1"/>
+                <w:bCs w:val="1"/>
+                <w:color w:val="000000" w:themeColor="text1" w:themeTint="FF" w:themeShade="FF"/>
                 <w:sz w:val="24"/>
                 <w:szCs w:val="24"/>
                 <w:u w:val="single"/>
@@ -758,7 +1266,7 @@
       </w:tr>
       <w:tr xmlns:wp14="http://schemas.microsoft.com/office/word/2010/wordml" wp14:textId="77777777">
         <w:trPr>
-          <w:trHeight w:val="1187"/>
+          <w:trHeight w:val="1905"/>
         </w:trPr>
         <w:tc>
           <w:tcPr>
@@ -766,39 +1274,32 @@
             <w:tcBorders>
               <w:top w:val="nil"/>
             </w:tcBorders>
+            <w:tcMar/>
+            <w:vAlign w:val="top"/>
           </w:tcPr>
-          <w:p wp14:textId="77777777">
+          <w:p wp14:textId="68E46A9B">
             <w:pPr>
               <w:pBdr>
-                <w:top w:val="nil"/>
-                <w:left w:val="nil"/>
-                <w:bottom w:val="nil"/>
-                <w:right w:val="nil"/>
-                <w:between w:val="nil"/>
+                <w:top w:val="nil" w:color="FF000000" w:sz="0" w:space="0"/>
+                <w:left w:val="nil" w:color="FF000000" w:sz="0" w:space="0"/>
+                <w:bottom w:val="nil" w:color="FF000000" w:sz="0" w:space="0"/>
+                <w:right w:val="nil" w:color="FF000000" w:sz="0" w:space="0"/>
+                <w:between w:val="nil" w:color="FF000000" w:sz="0" w:space="0"/>
               </w:pBdr>
+              <w:spacing w:before="240" w:beforeAutospacing="off"/>
               <w:ind w:left="35"/>
+              <w:jc w:val="left"/>
               <w:rPr>
                 <w:color w:val="000000"/>
-              </w:rPr>
-            </w:pPr>
-          </w:p>
-          <w:p wp14:textId="77777777">
-            <w:pPr>
-              <w:pBdr>
-                <w:top w:val="nil"/>
-                <w:left w:val="nil"/>
-                <w:bottom w:val="nil"/>
-                <w:right w:val="nil"/>
-                <w:between w:val="nil"/>
-              </w:pBdr>
-              <w:ind w:left="35"/>
-              <w:rPr>
-                <w:color w:val="000000"/>
+                <w:sz w:val="24"/>
+                <w:szCs w:val="24"/>
               </w:rPr>
             </w:pPr>
             <w:r>
               <w:rPr>
-                <w:color w:val="000000"/>
+                <w:color w:val="000000" w:themeColor="text1" w:themeTint="FF" w:themeShade="FF"/>
+                <w:sz w:val="24"/>
+                <w:szCs w:val="24"/>
               </w:rPr>
               <w:t>$summary</w:t>
             </w:r>
@@ -806,30 +1307,15 @@
         </w:tc>
       </w:tr>
     </w:tbl>
-    <w:p xmlns:wp14="http://schemas.microsoft.com/office/word/2010/wordml" wp14:textId="77777777">
+    <w:p xmlns:wp14="http://schemas.microsoft.com/office/word/2010/wordml" wp14:textId="63BE38FF">
       <w:pPr>
+        <w:pStyle w:val="Normal"/>
         <w:pBdr>
-          <w:top w:val="nil"/>
-          <w:left w:val="nil"/>
-          <w:bottom w:val="nil"/>
-          <w:right w:val="nil"/>
-          <w:between w:val="nil"/>
-        </w:pBdr>
-        <w:rPr>
-          <w:color w:val="000000"/>
-          <w:sz w:val="28"/>
-          <w:szCs w:val="28"/>
-        </w:rPr>
-      </w:pPr>
-    </w:p>
-    <w:p xmlns:wp14="http://schemas.microsoft.com/office/word/2010/wordml" wp14:textId="77777777">
-      <w:pPr>
-        <w:pBdr>
-          <w:top w:val="nil"/>
-          <w:left w:val="nil"/>
-          <w:bottom w:val="nil"/>
-          <w:right w:val="nil"/>
-          <w:between w:val="nil"/>
+          <w:top w:val="nil" w:color="FF000000" w:sz="0" w:space="0"/>
+          <w:left w:val="nil" w:color="FF000000" w:sz="0" w:space="0"/>
+          <w:bottom w:val="nil" w:color="FF000000" w:sz="0" w:space="0"/>
+          <w:right w:val="nil" w:color="FF000000" w:sz="0" w:space="0"/>
+          <w:between w:val="nil" w:color="FF000000" w:sz="0" w:space="0"/>
         </w:pBdr>
         <w:spacing w:before="250"/>
         <w:rPr>
@@ -842,6 +1328,8 @@
           <w:pgSz w:w="11910" w:h="16840" w:orient="portrait"/>
           <w:pgMar w:top="1500" w:right="1020" w:bottom="280" w:left="620" w:header="720" w:footer="720" w:gutter="0"/>
           <w:cols w:space="720"/>
+          <w:headerReference w:type="default" r:id="R59ff078d24924823"/>
+          <w:footerReference w:type="default" r:id="R097799822d4141e1"/>
         </w:sectPr>
       </w:pPr>
     </w:p>
@@ -852,7 +1340,7 @@
           <w:tab w:val="left" w:pos="3597"/>
           <w:tab w:val="left" w:pos="10134"/>
         </w:tabs>
-        <w:spacing w:before="1"/>
+        <w:spacing w:before="0" w:beforeAutospacing="off"/>
         <w:ind w:left="135"/>
         <w:rPr>
           <w:u w:val="none"/>
@@ -913,7 +1401,7 @@
       </w:r>
       <w:r>
         <w:drawing>
-          <wp:inline xmlns:wp14="http://schemas.microsoft.com/office/word/2010/wordprocessingDrawing" wp14:editId="080AEE66" wp14:anchorId="1D69159F">
+          <wp:inline xmlns:wp14="http://schemas.microsoft.com/office/word/2010/wordprocessingDrawing" wp14:editId="6A91CC9B" wp14:anchorId="1D69159F">
             <wp:extent cx="2847340" cy="2352675"/>
             <wp:effectExtent l="28575" t="28575" r="28575" b="28575"/>
             <wp:docPr id="12" name="image1.png" descr="Uma imagem contendo Gráfico&#10;&#10;Descrição gerada automaticamente"/>
@@ -964,7 +1452,7 @@
       </w:r>
       <w:r>
         <w:drawing>
-          <wp:inline xmlns:wp14="http://schemas.microsoft.com/office/word/2010/wordprocessingDrawing" wp14:editId="5AF7FFF9" wp14:anchorId="49078497">
+          <wp:inline xmlns:wp14="http://schemas.microsoft.com/office/word/2010/wordprocessingDrawing" wp14:editId="71E7FC21" wp14:anchorId="49078497">
             <wp:extent cx="2847340" cy="2352675"/>
             <wp:effectExtent l="28575" t="28575" r="28575" b="28575"/>
             <wp:docPr id="14" name="image8.png" descr="Forma&#10;&#10;Descrição gerada automaticamente"/>
@@ -1274,16 +1762,34 @@
     <w:p xmlns:wp14="http://schemas.microsoft.com/office/word/2010/wordml" wp14:textId="77777777">
       <w:pPr>
         <w:pBdr>
-          <w:top w:val="nil"/>
-          <w:left w:val="nil"/>
-          <w:bottom w:val="nil"/>
-          <w:right w:val="nil"/>
-          <w:between w:val="nil"/>
+          <w:top w:val="nil" w:color="FF000000" w:sz="0" w:space="0"/>
+          <w:left w:val="nil" w:color="FF000000" w:sz="0" w:space="0"/>
+          <w:bottom w:val="nil" w:color="FF000000" w:sz="0" w:space="0"/>
+          <w:right w:val="nil" w:color="FF000000" w:sz="0" w:space="0"/>
+          <w:between w:val="nil" w:color="FF000000" w:sz="0" w:space="0"/>
         </w:pBdr>
         <w:rPr>
-          <w:b/>
-          <w:bCs/>
+          <w:b w:val="1"/>
+          <w:bCs w:val="1"/>
           <w:color w:val="000000"/>
+          <w:sz w:val="20"/>
+          <w:szCs w:val="20"/>
+        </w:rPr>
+      </w:pPr>
+    </w:p>
+    <w:p>
+      <w:pPr>
+        <w:pBdr>
+          <w:top w:val="nil" w:color="FF000000" w:sz="0" w:space="0"/>
+          <w:left w:val="nil" w:color="FF000000" w:sz="0" w:space="0"/>
+          <w:bottom w:val="nil" w:color="FF000000" w:sz="0" w:space="0"/>
+          <w:right w:val="nil" w:color="FF000000" w:sz="0" w:space="0"/>
+          <w:between w:val="nil" w:color="FF000000" w:sz="0" w:space="0"/>
+        </w:pBdr>
+        <w:rPr>
+          <w:b w:val="1"/>
+          <w:bCs w:val="1"/>
+          <w:color w:val="000000" w:themeColor="text1" w:themeTint="FF" w:themeShade="FF"/>
           <w:sz w:val="20"/>
           <w:szCs w:val="20"/>
         </w:rPr>
@@ -1389,8 +1895,9 @@
           <w:tcPr>
             <w:tcW w:w="3710" w:type="dxa"/>
             <w:tcBorders>
-              <w:bottom w:val="single" w:color="000000" w:sz="6" w:space="0"/>
+              <w:bottom w:val="single" w:color="000000" w:themeColor="text1" w:sz="6" w:space="0"/>
             </w:tcBorders>
+            <w:tcMar/>
           </w:tcPr>
           <w:p wp14:textId="77777777">
             <w:pPr>
@@ -1413,15 +1920,16 @@
         <w:tc>
           <w:tcPr>
             <w:tcW w:w="5524" w:type="dxa"/>
+            <w:tcMar/>
           </w:tcPr>
-          <w:p wp14:textId="77777777">
+          <w:p wp14:textId="3F3E5C3D">
             <w:pPr>
               <w:pBdr>
-                <w:top w:val="nil"/>
-                <w:left w:val="nil"/>
-                <w:bottom w:val="nil"/>
-                <w:right w:val="nil"/>
-                <w:between w:val="nil"/>
+                <w:top w:val="nil" w:color="FF000000" w:sz="0" w:space="0"/>
+                <w:left w:val="nil" w:color="FF000000" w:sz="0" w:space="0"/>
+                <w:bottom w:val="nil" w:color="FF000000" w:sz="0" w:space="0"/>
+                <w:right w:val="nil" w:color="FF000000" w:sz="0" w:space="0"/>
+                <w:between w:val="nil" w:color="FF000000" w:sz="0" w:space="0"/>
               </w:pBdr>
               <w:tabs>
                 <w:tab w:val="left" w:pos="3180"/>
@@ -1432,21 +1940,22 @@
               <w:jc w:val="center"/>
               <w:rPr>
                 <w:color w:val="000000"/>
+                <w:u w:val="single"/>
               </w:rPr>
             </w:pPr>
             <w:r>
               <w:rPr>
-                <w:color w:val="000000"/>
+                <w:color w:val="000000" w:themeColor="text1" w:themeTint="FF" w:themeShade="FF"/>
                 <w:u w:val="single"/>
               </w:rPr>
-              <w:t xml:space="preserve">          São Paulo, $actual_date</w:t>
+              <w:t xml:space="preserve">    São Paulo, </w:t>
             </w:r>
             <w:r>
               <w:rPr>
-                <w:color w:val="000000"/>
+                <w:color w:val="000000" w:themeColor="text1" w:themeTint="FF" w:themeShade="FF"/>
                 <w:u w:val="single"/>
               </w:rPr>
-              <w:tab/>
+              <w:t>$actual_date</w:t>
             </w:r>
           </w:p>
         </w:tc>
@@ -1459,39 +1968,49 @@
           <w:tcPr>
             <w:tcW w:w="3710" w:type="dxa"/>
             <w:tcBorders>
-              <w:top w:val="single" w:color="000000" w:sz="6" w:space="0"/>
+              <w:top w:val="single" w:color="000000" w:themeColor="text1" w:sz="6" w:space="0"/>
             </w:tcBorders>
+            <w:tcMar/>
           </w:tcPr>
-          <w:p wp14:textId="77777777">
+          <w:p wp14:textId="137B2BC0">
             <w:pPr>
               <w:pBdr>
-                <w:top w:val="nil"/>
-                <w:left w:val="nil"/>
-                <w:bottom w:val="nil"/>
-                <w:right w:val="nil"/>
-                <w:between w:val="nil"/>
+                <w:top w:val="nil" w:color="FF000000" w:sz="0" w:space="0"/>
+                <w:left w:val="nil" w:color="FF000000" w:sz="0" w:space="0"/>
+                <w:bottom w:val="nil" w:color="FF000000" w:sz="0" w:space="0"/>
+                <w:right w:val="nil" w:color="FF000000" w:sz="0" w:space="0"/>
+                <w:between w:val="nil" w:color="FF000000" w:sz="0" w:space="0"/>
               </w:pBdr>
-              <w:spacing w:before="14"/>
+              <w:spacing w:before="0" w:beforeAutospacing="off"/>
               <w:ind w:left="7"/>
               <w:rPr>
-                <w:b/>
-                <w:bCs/>
+                <w:b w:val="1"/>
+                <w:bCs w:val="1"/>
                 <w:color w:val="000000"/>
               </w:rPr>
             </w:pPr>
             <w:r>
               <w:rPr>
-                <w:b/>
-                <w:bCs/>
-                <w:color w:val="000000"/>
-              </w:rPr>
-              <w:t>Assinatura Técnico Responsàvel</w:t>
+                <w:b w:val="1"/>
+                <w:bCs w:val="1"/>
+                <w:color w:val="000000" w:themeColor="text1" w:themeTint="FF" w:themeShade="FF"/>
+              </w:rPr>
+              <w:t xml:space="preserve">Assinatura Técnico </w:t>
+            </w:r>
+            <w:r>
+              <w:rPr>
+                <w:b w:val="1"/>
+                <w:bCs w:val="1"/>
+                <w:color w:val="000000" w:themeColor="text1" w:themeTint="FF" w:themeShade="FF"/>
+              </w:rPr>
+              <w:t>Responsável</w:t>
             </w:r>
           </w:p>
         </w:tc>
         <w:tc>
           <w:tcPr>
             <w:tcW w:w="5524" w:type="dxa"/>
+            <w:tcMar/>
           </w:tcPr>
           <w:p wp14:textId="77777777">
             <w:pPr>
@@ -1529,6 +2048,7 @@
         <w:tc>
           <w:tcPr>
             <w:tcW w:w="3710" w:type="dxa"/>
+            <w:tcMar/>
           </w:tcPr>
           <w:p wp14:textId="77777777">
             <w:pPr>
@@ -1560,6 +2080,7 @@
         <w:tc>
           <w:tcPr>
             <w:tcW w:w="5524" w:type="dxa"/>
+            <w:tcMar/>
           </w:tcPr>
           <w:p wp14:textId="77777777">
             <w:pPr>
@@ -1587,9 +2108,1415 @@
       <w:pgSz w:w="11910" w:h="16840" w:orient="portrait"/>
       <w:pgMar w:top="1120" w:right="1020" w:bottom="280" w:left="620" w:header="720" w:footer="720" w:gutter="0"/>
       <w:cols w:space="720"/>
+      <w:headerReference w:type="default" r:id="Rfdb754dbd6fd422f"/>
+      <w:footerReference w:type="default" r:id="Rc7f4a503f88d4386"/>
     </w:sectPr>
   </w:body>
 </w:document>
+</file>
+
+<file path=word/footer.xml><?xml version="1.0" encoding="utf-8"?>
+<w:ftr xmlns:w14="http://schemas.microsoft.com/office/word/2010/wordml" xmlns:w="http://schemas.openxmlformats.org/wordprocessingml/2006/main">
+  <w:tbl>
+    <w:tblPr>
+      <w:tblStyle w:val="Tabelanormal"/>
+      <w:bidiVisual w:val="0"/>
+      <w:tblW w:w="0" w:type="auto"/>
+      <w:tblLook w:val="06A0" w:firstRow="1" w:lastRow="0" w:firstColumn="1" w:lastColumn="0" w:noHBand="1" w:noVBand="1"/>
+    </w:tblPr>
+    <w:tblGrid>
+      <w:gridCol w:w="3420"/>
+      <w:gridCol w:w="3420"/>
+      <w:gridCol w:w="3420"/>
+    </w:tblGrid>
+    <w:tr>
+      <w:trPr>
+        <w:trHeight w:val="300"/>
+      </w:trPr>
+      <w:tc>
+        <w:tcPr>
+          <w:tcW w:w="3420" w:type="dxa"/>
+          <w:tcMar/>
+        </w:tcPr>
+        <w:p>
+          <w:pPr>
+            <w:pStyle w:val="Header"/>
+            <w:bidi w:val="0"/>
+            <w:ind w:left="-115"/>
+            <w:jc w:val="left"/>
+          </w:pPr>
+        </w:p>
+      </w:tc>
+      <w:tc>
+        <w:tcPr>
+          <w:tcW w:w="3420" w:type="dxa"/>
+          <w:tcMar/>
+        </w:tcPr>
+        <w:p>
+          <w:pPr>
+            <w:pStyle w:val="Header"/>
+            <w:bidi w:val="0"/>
+            <w:jc w:val="center"/>
+          </w:pPr>
+        </w:p>
+      </w:tc>
+      <w:tc>
+        <w:tcPr>
+          <w:tcW w:w="3420" w:type="dxa"/>
+          <w:tcMar/>
+        </w:tcPr>
+        <w:p>
+          <w:pPr>
+            <w:pStyle w:val="Header"/>
+            <w:bidi w:val="0"/>
+            <w:ind w:right="-115"/>
+            <w:jc w:val="right"/>
+          </w:pPr>
+        </w:p>
+      </w:tc>
+    </w:tr>
+  </w:tbl>
+  <w:p>
+    <w:pPr>
+      <w:pStyle w:val="Footer"/>
+      <w:bidi w:val="0"/>
+    </w:pPr>
+  </w:p>
+</w:ftr>
+</file>
+
+<file path=word/footer2.xml><?xml version="1.0" encoding="utf-8"?>
+<w:ftr xmlns:w14="http://schemas.microsoft.com/office/word/2010/wordml" xmlns:w="http://schemas.openxmlformats.org/wordprocessingml/2006/main">
+  <w:tbl>
+    <w:tblPr>
+      <w:tblStyle w:val="Tabelanormal"/>
+      <w:bidiVisual w:val="0"/>
+      <w:tblW w:w="0" w:type="auto"/>
+      <w:tblLook w:val="06A0" w:firstRow="1" w:lastRow="0" w:firstColumn="1" w:lastColumn="0" w:noHBand="1" w:noVBand="1"/>
+    </w:tblPr>
+    <w:tblGrid>
+      <w:gridCol w:w="3420"/>
+      <w:gridCol w:w="3420"/>
+      <w:gridCol w:w="3420"/>
+    </w:tblGrid>
+    <w:tr>
+      <w:trPr>
+        <w:trHeight w:val="300"/>
+      </w:trPr>
+      <w:tc>
+        <w:tcPr>
+          <w:tcW w:w="3420" w:type="dxa"/>
+          <w:tcMar/>
+        </w:tcPr>
+        <w:p>
+          <w:pPr>
+            <w:pStyle w:val="Header"/>
+            <w:bidi w:val="0"/>
+            <w:ind w:left="-115"/>
+            <w:jc w:val="left"/>
+          </w:pPr>
+        </w:p>
+      </w:tc>
+      <w:tc>
+        <w:tcPr>
+          <w:tcW w:w="3420" w:type="dxa"/>
+          <w:tcMar/>
+        </w:tcPr>
+        <w:p>
+          <w:pPr>
+            <w:pStyle w:val="Header"/>
+            <w:bidi w:val="0"/>
+            <w:jc w:val="center"/>
+          </w:pPr>
+        </w:p>
+      </w:tc>
+      <w:tc>
+        <w:tcPr>
+          <w:tcW w:w="3420" w:type="dxa"/>
+          <w:tcMar/>
+        </w:tcPr>
+        <w:p>
+          <w:pPr>
+            <w:pStyle w:val="Header"/>
+            <w:bidi w:val="0"/>
+            <w:ind w:right="-115"/>
+            <w:jc w:val="right"/>
+          </w:pPr>
+        </w:p>
+      </w:tc>
+    </w:tr>
+  </w:tbl>
+  <w:p>
+    <w:pPr>
+      <w:pStyle w:val="Footer"/>
+      <w:bidi w:val="0"/>
+    </w:pPr>
+  </w:p>
+</w:ftr>
+</file>
+
+<file path=word/footer3.xml><?xml version="1.0" encoding="utf-8"?>
+<w:ftr xmlns:w14="http://schemas.microsoft.com/office/word/2010/wordml" xmlns:w="http://schemas.openxmlformats.org/wordprocessingml/2006/main">
+  <w:tbl>
+    <w:tblPr>
+      <w:tblStyle w:val="Tabelanormal"/>
+      <w:bidiVisual w:val="0"/>
+      <w:tblW w:w="0" w:type="auto"/>
+      <w:tblLook w:val="06A0" w:firstRow="1" w:lastRow="0" w:firstColumn="1" w:lastColumn="0" w:noHBand="1" w:noVBand="1"/>
+    </w:tblPr>
+    <w:tblGrid>
+      <w:gridCol w:w="3420"/>
+      <w:gridCol w:w="3420"/>
+      <w:gridCol w:w="3420"/>
+    </w:tblGrid>
+    <w:tr>
+      <w:trPr>
+        <w:trHeight w:val="300"/>
+      </w:trPr>
+      <w:tc>
+        <w:tcPr>
+          <w:tcW w:w="3420" w:type="dxa"/>
+          <w:tcMar/>
+        </w:tcPr>
+        <w:p>
+          <w:pPr>
+            <w:pStyle w:val="Header"/>
+            <w:bidi w:val="0"/>
+            <w:ind w:left="-115"/>
+            <w:jc w:val="left"/>
+          </w:pPr>
+        </w:p>
+      </w:tc>
+      <w:tc>
+        <w:tcPr>
+          <w:tcW w:w="3420" w:type="dxa"/>
+          <w:tcMar/>
+        </w:tcPr>
+        <w:p>
+          <w:pPr>
+            <w:pStyle w:val="Header"/>
+            <w:bidi w:val="0"/>
+            <w:jc w:val="center"/>
+          </w:pPr>
+        </w:p>
+      </w:tc>
+      <w:tc>
+        <w:tcPr>
+          <w:tcW w:w="3420" w:type="dxa"/>
+          <w:tcMar/>
+        </w:tcPr>
+        <w:p>
+          <w:pPr>
+            <w:pStyle w:val="Header"/>
+            <w:bidi w:val="0"/>
+            <w:ind w:right="-115"/>
+            <w:jc w:val="right"/>
+          </w:pPr>
+        </w:p>
+      </w:tc>
+    </w:tr>
+  </w:tbl>
+  <w:p>
+    <w:pPr>
+      <w:pStyle w:val="Footer"/>
+      <w:bidi w:val="0"/>
+    </w:pPr>
+  </w:p>
+</w:ftr>
+</file>
+
+<file path=word/footer4.xml><?xml version="1.0" encoding="utf-8"?>
+<w:ftr xmlns:w14="http://schemas.microsoft.com/office/word/2010/wordml" xmlns:w="http://schemas.openxmlformats.org/wordprocessingml/2006/main">
+  <w:tbl>
+    <w:tblPr>
+      <w:tblStyle w:val="Tabelanormal"/>
+      <w:bidiVisual w:val="0"/>
+      <w:tblW w:w="0" w:type="auto"/>
+      <w:tblLook w:val="06A0" w:firstRow="1" w:lastRow="0" w:firstColumn="1" w:lastColumn="0" w:noHBand="1" w:noVBand="1"/>
+    </w:tblPr>
+    <w:tblGrid>
+      <w:gridCol w:w="3420"/>
+      <w:gridCol w:w="3420"/>
+      <w:gridCol w:w="3420"/>
+    </w:tblGrid>
+    <w:tr>
+      <w:trPr>
+        <w:trHeight w:val="300"/>
+      </w:trPr>
+      <w:tc>
+        <w:tcPr>
+          <w:tcW w:w="3420" w:type="dxa"/>
+          <w:tcMar/>
+        </w:tcPr>
+        <w:p>
+          <w:pPr>
+            <w:pStyle w:val="Header"/>
+            <w:bidi w:val="0"/>
+            <w:ind w:left="-115"/>
+            <w:jc w:val="left"/>
+          </w:pPr>
+        </w:p>
+      </w:tc>
+      <w:tc>
+        <w:tcPr>
+          <w:tcW w:w="3420" w:type="dxa"/>
+          <w:tcMar/>
+        </w:tcPr>
+        <w:p>
+          <w:pPr>
+            <w:pStyle w:val="Header"/>
+            <w:bidi w:val="0"/>
+            <w:jc w:val="center"/>
+          </w:pPr>
+        </w:p>
+      </w:tc>
+      <w:tc>
+        <w:tcPr>
+          <w:tcW w:w="3420" w:type="dxa"/>
+          <w:tcMar/>
+        </w:tcPr>
+        <w:p>
+          <w:pPr>
+            <w:pStyle w:val="Header"/>
+            <w:bidi w:val="0"/>
+            <w:ind w:right="-115"/>
+            <w:jc w:val="right"/>
+          </w:pPr>
+        </w:p>
+      </w:tc>
+    </w:tr>
+  </w:tbl>
+  <w:p>
+    <w:pPr>
+      <w:pStyle w:val="Footer"/>
+      <w:bidi w:val="0"/>
+    </w:pPr>
+  </w:p>
+</w:ftr>
+</file>
+
+<file path=word/footer5.xml><?xml version="1.0" encoding="utf-8"?>
+<w:ftr xmlns:w14="http://schemas.microsoft.com/office/word/2010/wordml" xmlns:w="http://schemas.openxmlformats.org/wordprocessingml/2006/main">
+  <w:tbl>
+    <w:tblPr>
+      <w:tblStyle w:val="Tabelanormal"/>
+      <w:bidiVisual w:val="0"/>
+      <w:tblW w:w="0" w:type="auto"/>
+      <w:tblLook w:val="06A0" w:firstRow="1" w:lastRow="0" w:firstColumn="1" w:lastColumn="0" w:noHBand="1" w:noVBand="1"/>
+    </w:tblPr>
+    <w:tblGrid>
+      <w:gridCol w:w="3420"/>
+      <w:gridCol w:w="3420"/>
+      <w:gridCol w:w="3420"/>
+    </w:tblGrid>
+    <w:tr>
+      <w:trPr>
+        <w:trHeight w:val="300"/>
+      </w:trPr>
+      <w:tc>
+        <w:tcPr>
+          <w:tcW w:w="3420" w:type="dxa"/>
+          <w:tcMar/>
+        </w:tcPr>
+        <w:p>
+          <w:pPr>
+            <w:pStyle w:val="Header"/>
+            <w:bidi w:val="0"/>
+            <w:ind w:left="-115"/>
+            <w:jc w:val="left"/>
+          </w:pPr>
+        </w:p>
+      </w:tc>
+      <w:tc>
+        <w:tcPr>
+          <w:tcW w:w="3420" w:type="dxa"/>
+          <w:tcMar/>
+        </w:tcPr>
+        <w:p>
+          <w:pPr>
+            <w:pStyle w:val="Header"/>
+            <w:bidi w:val="0"/>
+            <w:jc w:val="center"/>
+          </w:pPr>
+        </w:p>
+      </w:tc>
+      <w:tc>
+        <w:tcPr>
+          <w:tcW w:w="3420" w:type="dxa"/>
+          <w:tcMar/>
+        </w:tcPr>
+        <w:p>
+          <w:pPr>
+            <w:pStyle w:val="Header"/>
+            <w:bidi w:val="0"/>
+            <w:ind w:right="-115"/>
+            <w:jc w:val="right"/>
+          </w:pPr>
+        </w:p>
+      </w:tc>
+    </w:tr>
+  </w:tbl>
+  <w:p>
+    <w:pPr>
+      <w:pStyle w:val="Footer"/>
+      <w:bidi w:val="0"/>
+    </w:pPr>
+  </w:p>
+</w:ftr>
+</file>
+
+<file path=word/footer6.xml><?xml version="1.0" encoding="utf-8"?>
+<w:ftr xmlns:w14="http://schemas.microsoft.com/office/word/2010/wordml" xmlns:w="http://schemas.openxmlformats.org/wordprocessingml/2006/main">
+  <w:tbl>
+    <w:tblPr>
+      <w:tblStyle w:val="Tabelanormal"/>
+      <w:bidiVisual w:val="0"/>
+      <w:tblW w:w="0" w:type="auto"/>
+      <w:tblLook w:val="06A0" w:firstRow="1" w:lastRow="0" w:firstColumn="1" w:lastColumn="0" w:noHBand="1" w:noVBand="1"/>
+    </w:tblPr>
+    <w:tblGrid>
+      <w:gridCol w:w="3420"/>
+      <w:gridCol w:w="3420"/>
+      <w:gridCol w:w="3420"/>
+    </w:tblGrid>
+    <w:tr>
+      <w:trPr>
+        <w:trHeight w:val="300"/>
+      </w:trPr>
+      <w:tc>
+        <w:tcPr>
+          <w:tcW w:w="3420" w:type="dxa"/>
+          <w:tcMar/>
+        </w:tcPr>
+        <w:p>
+          <w:pPr>
+            <w:pStyle w:val="Header"/>
+            <w:bidi w:val="0"/>
+            <w:ind w:left="-115"/>
+            <w:jc w:val="left"/>
+          </w:pPr>
+        </w:p>
+      </w:tc>
+      <w:tc>
+        <w:tcPr>
+          <w:tcW w:w="3420" w:type="dxa"/>
+          <w:tcMar/>
+        </w:tcPr>
+        <w:p>
+          <w:pPr>
+            <w:pStyle w:val="Header"/>
+            <w:bidi w:val="0"/>
+            <w:jc w:val="center"/>
+          </w:pPr>
+        </w:p>
+      </w:tc>
+      <w:tc>
+        <w:tcPr>
+          <w:tcW w:w="3420" w:type="dxa"/>
+          <w:tcMar/>
+        </w:tcPr>
+        <w:p>
+          <w:pPr>
+            <w:pStyle w:val="Header"/>
+            <w:bidi w:val="0"/>
+            <w:ind w:right="-115"/>
+            <w:jc w:val="right"/>
+          </w:pPr>
+        </w:p>
+      </w:tc>
+    </w:tr>
+  </w:tbl>
+  <w:p>
+    <w:pPr>
+      <w:pStyle w:val="Footer"/>
+      <w:bidi w:val="0"/>
+    </w:pPr>
+  </w:p>
+</w:ftr>
+</file>
+
+<file path=word/footer7.xml><?xml version="1.0" encoding="utf-8"?>
+<w:ftr xmlns:w14="http://schemas.microsoft.com/office/word/2010/wordml" xmlns:w="http://schemas.openxmlformats.org/wordprocessingml/2006/main">
+  <w:tbl>
+    <w:tblPr>
+      <w:tblStyle w:val="Tabelanormal"/>
+      <w:bidiVisual w:val="0"/>
+      <w:tblW w:w="0" w:type="auto"/>
+      <w:tblLook w:val="06A0" w:firstRow="1" w:lastRow="0" w:firstColumn="1" w:lastColumn="0" w:noHBand="1" w:noVBand="1"/>
+    </w:tblPr>
+    <w:tblGrid>
+      <w:gridCol w:w="3420"/>
+      <w:gridCol w:w="3420"/>
+      <w:gridCol w:w="3420"/>
+    </w:tblGrid>
+    <w:tr>
+      <w:trPr>
+        <w:trHeight w:val="300"/>
+      </w:trPr>
+      <w:tc>
+        <w:tcPr>
+          <w:tcW w:w="3420" w:type="dxa"/>
+          <w:tcMar/>
+        </w:tcPr>
+        <w:p>
+          <w:pPr>
+            <w:pStyle w:val="Header"/>
+            <w:bidi w:val="0"/>
+            <w:ind w:left="-115"/>
+            <w:jc w:val="left"/>
+          </w:pPr>
+        </w:p>
+      </w:tc>
+      <w:tc>
+        <w:tcPr>
+          <w:tcW w:w="3420" w:type="dxa"/>
+          <w:tcMar/>
+        </w:tcPr>
+        <w:p>
+          <w:pPr>
+            <w:pStyle w:val="Header"/>
+            <w:bidi w:val="0"/>
+            <w:jc w:val="center"/>
+          </w:pPr>
+        </w:p>
+      </w:tc>
+      <w:tc>
+        <w:tcPr>
+          <w:tcW w:w="3420" w:type="dxa"/>
+          <w:tcMar/>
+        </w:tcPr>
+        <w:p>
+          <w:pPr>
+            <w:pStyle w:val="Header"/>
+            <w:bidi w:val="0"/>
+            <w:ind w:right="-115"/>
+            <w:jc w:val="right"/>
+          </w:pPr>
+        </w:p>
+      </w:tc>
+    </w:tr>
+  </w:tbl>
+  <w:p>
+    <w:pPr>
+      <w:pStyle w:val="Footer"/>
+      <w:bidi w:val="0"/>
+    </w:pPr>
+  </w:p>
+</w:ftr>
+</file>
+
+<file path=word/footer8.xml><?xml version="1.0" encoding="utf-8"?>
+<w:ftr xmlns:w14="http://schemas.microsoft.com/office/word/2010/wordml" xmlns:w="http://schemas.openxmlformats.org/wordprocessingml/2006/main">
+  <w:tbl>
+    <w:tblPr>
+      <w:tblStyle w:val="Tabelanormal"/>
+      <w:bidiVisual w:val="0"/>
+      <w:tblW w:w="0" w:type="auto"/>
+      <w:tblLook w:val="06A0" w:firstRow="1" w:lastRow="0" w:firstColumn="1" w:lastColumn="0" w:noHBand="1" w:noVBand="1"/>
+    </w:tblPr>
+    <w:tblGrid>
+      <w:gridCol w:w="3420"/>
+      <w:gridCol w:w="3420"/>
+      <w:gridCol w:w="3420"/>
+    </w:tblGrid>
+    <w:tr>
+      <w:trPr>
+        <w:trHeight w:val="300"/>
+      </w:trPr>
+      <w:tc>
+        <w:tcPr>
+          <w:tcW w:w="3420" w:type="dxa"/>
+          <w:tcMar/>
+        </w:tcPr>
+        <w:p>
+          <w:pPr>
+            <w:pStyle w:val="Header"/>
+            <w:bidi w:val="0"/>
+            <w:ind w:left="-115"/>
+            <w:jc w:val="left"/>
+          </w:pPr>
+        </w:p>
+      </w:tc>
+      <w:tc>
+        <w:tcPr>
+          <w:tcW w:w="3420" w:type="dxa"/>
+          <w:tcMar/>
+        </w:tcPr>
+        <w:p>
+          <w:pPr>
+            <w:pStyle w:val="Header"/>
+            <w:bidi w:val="0"/>
+            <w:jc w:val="center"/>
+          </w:pPr>
+        </w:p>
+      </w:tc>
+      <w:tc>
+        <w:tcPr>
+          <w:tcW w:w="3420" w:type="dxa"/>
+          <w:tcMar/>
+        </w:tcPr>
+        <w:p>
+          <w:pPr>
+            <w:pStyle w:val="Header"/>
+            <w:bidi w:val="0"/>
+            <w:ind w:right="-115"/>
+            <w:jc w:val="right"/>
+          </w:pPr>
+        </w:p>
+      </w:tc>
+    </w:tr>
+  </w:tbl>
+  <w:p>
+    <w:pPr>
+      <w:pStyle w:val="Footer"/>
+      <w:bidi w:val="0"/>
+    </w:pPr>
+  </w:p>
+</w:ftr>
+</file>
+
+<file path=word/footer9.xml><?xml version="1.0" encoding="utf-8"?>
+<w:ftr xmlns:w14="http://schemas.microsoft.com/office/word/2010/wordml" xmlns:w="http://schemas.openxmlformats.org/wordprocessingml/2006/main">
+  <w:tbl>
+    <w:tblPr>
+      <w:tblStyle w:val="Tabelanormal"/>
+      <w:bidiVisual w:val="0"/>
+      <w:tblW w:w="0" w:type="auto"/>
+      <w:tblLook w:val="06A0" w:firstRow="1" w:lastRow="0" w:firstColumn="1" w:lastColumn="0" w:noHBand="1" w:noVBand="1"/>
+    </w:tblPr>
+    <w:tblGrid>
+      <w:gridCol w:w="3420"/>
+      <w:gridCol w:w="3420"/>
+      <w:gridCol w:w="3420"/>
+    </w:tblGrid>
+    <w:tr>
+      <w:trPr>
+        <w:trHeight w:val="300"/>
+      </w:trPr>
+      <w:tc>
+        <w:tcPr>
+          <w:tcW w:w="3420" w:type="dxa"/>
+          <w:tcMar/>
+        </w:tcPr>
+        <w:p>
+          <w:pPr>
+            <w:pStyle w:val="Header"/>
+            <w:bidi w:val="0"/>
+            <w:ind w:left="-115"/>
+            <w:jc w:val="left"/>
+          </w:pPr>
+        </w:p>
+      </w:tc>
+      <w:tc>
+        <w:tcPr>
+          <w:tcW w:w="3420" w:type="dxa"/>
+          <w:tcMar/>
+        </w:tcPr>
+        <w:p>
+          <w:pPr>
+            <w:pStyle w:val="Header"/>
+            <w:bidi w:val="0"/>
+            <w:jc w:val="center"/>
+          </w:pPr>
+        </w:p>
+      </w:tc>
+      <w:tc>
+        <w:tcPr>
+          <w:tcW w:w="3420" w:type="dxa"/>
+          <w:tcMar/>
+        </w:tcPr>
+        <w:p>
+          <w:pPr>
+            <w:pStyle w:val="Header"/>
+            <w:bidi w:val="0"/>
+            <w:ind w:right="-115"/>
+            <w:jc w:val="right"/>
+          </w:pPr>
+        </w:p>
+      </w:tc>
+    </w:tr>
+  </w:tbl>
+  <w:p>
+    <w:pPr>
+      <w:pStyle w:val="Footer"/>
+      <w:bidi w:val="0"/>
+    </w:pPr>
+  </w:p>
+</w:ftr>
+</file>
+
+<file path=word/footera.xml><?xml version="1.0" encoding="utf-8"?>
+<w:ftr xmlns:w14="http://schemas.microsoft.com/office/word/2010/wordml" xmlns:w="http://schemas.openxmlformats.org/wordprocessingml/2006/main">
+  <w:tbl>
+    <w:tblPr>
+      <w:tblStyle w:val="Tabelanormal"/>
+      <w:bidiVisual w:val="0"/>
+      <w:tblW w:w="0" w:type="auto"/>
+      <w:tblLook w:val="06A0" w:firstRow="1" w:lastRow="0" w:firstColumn="1" w:lastColumn="0" w:noHBand="1" w:noVBand="1"/>
+    </w:tblPr>
+    <w:tblGrid>
+      <w:gridCol w:w="3420"/>
+      <w:gridCol w:w="3420"/>
+      <w:gridCol w:w="3420"/>
+    </w:tblGrid>
+    <w:tr>
+      <w:trPr>
+        <w:trHeight w:val="300"/>
+      </w:trPr>
+      <w:tc>
+        <w:tcPr>
+          <w:tcW w:w="3420" w:type="dxa"/>
+          <w:tcMar/>
+        </w:tcPr>
+        <w:p>
+          <w:pPr>
+            <w:pStyle w:val="Header"/>
+            <w:bidi w:val="0"/>
+            <w:ind w:left="-115"/>
+            <w:jc w:val="left"/>
+          </w:pPr>
+        </w:p>
+      </w:tc>
+      <w:tc>
+        <w:tcPr>
+          <w:tcW w:w="3420" w:type="dxa"/>
+          <w:tcMar/>
+        </w:tcPr>
+        <w:p>
+          <w:pPr>
+            <w:pStyle w:val="Header"/>
+            <w:bidi w:val="0"/>
+            <w:jc w:val="center"/>
+          </w:pPr>
+        </w:p>
+      </w:tc>
+      <w:tc>
+        <w:tcPr>
+          <w:tcW w:w="3420" w:type="dxa"/>
+          <w:tcMar/>
+        </w:tcPr>
+        <w:p>
+          <w:pPr>
+            <w:pStyle w:val="Header"/>
+            <w:bidi w:val="0"/>
+            <w:jc w:val="right"/>
+          </w:pPr>
+        </w:p>
+      </w:tc>
+    </w:tr>
+  </w:tbl>
+</w:ftr>
+</file>
+
+<file path=word/header.xml><?xml version="1.0" encoding="utf-8"?>
+<w:hdr xmlns:w14="http://schemas.microsoft.com/office/word/2010/wordml" xmlns:w="http://schemas.openxmlformats.org/wordprocessingml/2006/main">
+  <w:tbl>
+    <w:tblPr>
+      <w:tblStyle w:val="Tabelanormal"/>
+      <w:bidiVisual w:val="0"/>
+      <w:tblW w:w="0" w:type="auto"/>
+      <w:tblLook w:val="06A0" w:firstRow="1" w:lastRow="0" w:firstColumn="1" w:lastColumn="0" w:noHBand="1" w:noVBand="1"/>
+    </w:tblPr>
+    <w:tblGrid>
+      <w:gridCol w:w="3420"/>
+      <w:gridCol w:w="3420"/>
+      <w:gridCol w:w="3420"/>
+    </w:tblGrid>
+    <w:tr>
+      <w:trPr>
+        <w:trHeight w:val="300"/>
+      </w:trPr>
+      <w:tc>
+        <w:tcPr>
+          <w:tcW w:w="3420" w:type="dxa"/>
+          <w:tcMar/>
+        </w:tcPr>
+        <w:p>
+          <w:pPr>
+            <w:pStyle w:val="Header"/>
+            <w:bidi w:val="0"/>
+            <w:ind w:left="-115"/>
+            <w:jc w:val="left"/>
+          </w:pPr>
+        </w:p>
+      </w:tc>
+      <w:tc>
+        <w:tcPr>
+          <w:tcW w:w="3420" w:type="dxa"/>
+          <w:tcMar/>
+        </w:tcPr>
+        <w:p>
+          <w:pPr>
+            <w:pStyle w:val="Header"/>
+            <w:bidi w:val="0"/>
+            <w:jc w:val="center"/>
+          </w:pPr>
+        </w:p>
+      </w:tc>
+      <w:tc>
+        <w:tcPr>
+          <w:tcW w:w="3420" w:type="dxa"/>
+          <w:tcMar/>
+        </w:tcPr>
+        <w:p>
+          <w:pPr>
+            <w:pStyle w:val="Header"/>
+            <w:bidi w:val="0"/>
+            <w:ind w:right="-115"/>
+            <w:jc w:val="right"/>
+          </w:pPr>
+        </w:p>
+      </w:tc>
+    </w:tr>
+  </w:tbl>
+  <w:p>
+    <w:pPr>
+      <w:pStyle w:val="Header"/>
+      <w:bidi w:val="0"/>
+    </w:pPr>
+  </w:p>
+</w:hdr>
+</file>
+
+<file path=word/header2.xml><?xml version="1.0" encoding="utf-8"?>
+<w:hdr xmlns:w14="http://schemas.microsoft.com/office/word/2010/wordml" xmlns:w="http://schemas.openxmlformats.org/wordprocessingml/2006/main">
+  <w:tbl>
+    <w:tblPr>
+      <w:tblStyle w:val="Tabelanormal"/>
+      <w:bidiVisual w:val="0"/>
+      <w:tblW w:w="0" w:type="auto"/>
+      <w:tblLook w:val="06A0" w:firstRow="1" w:lastRow="0" w:firstColumn="1" w:lastColumn="0" w:noHBand="1" w:noVBand="1"/>
+    </w:tblPr>
+    <w:tblGrid>
+      <w:gridCol w:w="3420"/>
+      <w:gridCol w:w="3420"/>
+      <w:gridCol w:w="3420"/>
+    </w:tblGrid>
+    <w:tr>
+      <w:trPr>
+        <w:trHeight w:val="300"/>
+      </w:trPr>
+      <w:tc>
+        <w:tcPr>
+          <w:tcW w:w="3420" w:type="dxa"/>
+          <w:tcMar/>
+        </w:tcPr>
+        <w:p>
+          <w:pPr>
+            <w:pStyle w:val="Header"/>
+            <w:bidi w:val="0"/>
+            <w:ind w:left="-115"/>
+            <w:jc w:val="left"/>
+          </w:pPr>
+        </w:p>
+      </w:tc>
+      <w:tc>
+        <w:tcPr>
+          <w:tcW w:w="3420" w:type="dxa"/>
+          <w:tcMar/>
+        </w:tcPr>
+        <w:p>
+          <w:pPr>
+            <w:pStyle w:val="Header"/>
+            <w:bidi w:val="0"/>
+            <w:jc w:val="center"/>
+          </w:pPr>
+        </w:p>
+      </w:tc>
+      <w:tc>
+        <w:tcPr>
+          <w:tcW w:w="3420" w:type="dxa"/>
+          <w:tcMar/>
+        </w:tcPr>
+        <w:p>
+          <w:pPr>
+            <w:pStyle w:val="Header"/>
+            <w:bidi w:val="0"/>
+            <w:ind w:right="-115"/>
+            <w:jc w:val="right"/>
+          </w:pPr>
+        </w:p>
+      </w:tc>
+    </w:tr>
+  </w:tbl>
+  <w:p>
+    <w:pPr>
+      <w:pStyle w:val="Header"/>
+      <w:bidi w:val="0"/>
+    </w:pPr>
+  </w:p>
+</w:hdr>
+</file>
+
+<file path=word/header3.xml><?xml version="1.0" encoding="utf-8"?>
+<w:hdr xmlns:w14="http://schemas.microsoft.com/office/word/2010/wordml" xmlns:w="http://schemas.openxmlformats.org/wordprocessingml/2006/main">
+  <w:tbl>
+    <w:tblPr>
+      <w:tblStyle w:val="Tabelanormal"/>
+      <w:bidiVisual w:val="0"/>
+      <w:tblW w:w="0" w:type="auto"/>
+      <w:tblLook w:val="06A0" w:firstRow="1" w:lastRow="0" w:firstColumn="1" w:lastColumn="0" w:noHBand="1" w:noVBand="1"/>
+    </w:tblPr>
+    <w:tblGrid>
+      <w:gridCol w:w="3420"/>
+      <w:gridCol w:w="3420"/>
+      <w:gridCol w:w="3420"/>
+    </w:tblGrid>
+    <w:tr>
+      <w:trPr>
+        <w:trHeight w:val="300"/>
+      </w:trPr>
+      <w:tc>
+        <w:tcPr>
+          <w:tcW w:w="3420" w:type="dxa"/>
+          <w:tcMar/>
+        </w:tcPr>
+        <w:p>
+          <w:pPr>
+            <w:pStyle w:val="Header"/>
+            <w:bidi w:val="0"/>
+            <w:ind w:left="-115"/>
+            <w:jc w:val="left"/>
+          </w:pPr>
+        </w:p>
+      </w:tc>
+      <w:tc>
+        <w:tcPr>
+          <w:tcW w:w="3420" w:type="dxa"/>
+          <w:tcMar/>
+        </w:tcPr>
+        <w:p>
+          <w:pPr>
+            <w:pStyle w:val="Header"/>
+            <w:bidi w:val="0"/>
+            <w:jc w:val="center"/>
+          </w:pPr>
+        </w:p>
+      </w:tc>
+      <w:tc>
+        <w:tcPr>
+          <w:tcW w:w="3420" w:type="dxa"/>
+          <w:tcMar/>
+        </w:tcPr>
+        <w:p>
+          <w:pPr>
+            <w:pStyle w:val="Header"/>
+            <w:bidi w:val="0"/>
+            <w:ind w:right="-115"/>
+            <w:jc w:val="right"/>
+          </w:pPr>
+        </w:p>
+      </w:tc>
+    </w:tr>
+  </w:tbl>
+  <w:p>
+    <w:pPr>
+      <w:pStyle w:val="Header"/>
+      <w:bidi w:val="0"/>
+    </w:pPr>
+  </w:p>
+</w:hdr>
+</file>
+
+<file path=word/header4.xml><?xml version="1.0" encoding="utf-8"?>
+<w:hdr xmlns:w14="http://schemas.microsoft.com/office/word/2010/wordml" xmlns:w="http://schemas.openxmlformats.org/wordprocessingml/2006/main">
+  <w:tbl>
+    <w:tblPr>
+      <w:tblStyle w:val="Tabelanormal"/>
+      <w:bidiVisual w:val="0"/>
+      <w:tblW w:w="0" w:type="auto"/>
+      <w:tblLook w:val="06A0" w:firstRow="1" w:lastRow="0" w:firstColumn="1" w:lastColumn="0" w:noHBand="1" w:noVBand="1"/>
+    </w:tblPr>
+    <w:tblGrid>
+      <w:gridCol w:w="3420"/>
+      <w:gridCol w:w="3420"/>
+      <w:gridCol w:w="3420"/>
+    </w:tblGrid>
+    <w:tr>
+      <w:trPr>
+        <w:trHeight w:val="300"/>
+      </w:trPr>
+      <w:tc>
+        <w:tcPr>
+          <w:tcW w:w="3420" w:type="dxa"/>
+          <w:tcMar/>
+        </w:tcPr>
+        <w:p>
+          <w:pPr>
+            <w:pStyle w:val="Header"/>
+            <w:bidi w:val="0"/>
+            <w:ind w:left="-115"/>
+            <w:jc w:val="left"/>
+          </w:pPr>
+        </w:p>
+      </w:tc>
+      <w:tc>
+        <w:tcPr>
+          <w:tcW w:w="3420" w:type="dxa"/>
+          <w:tcMar/>
+        </w:tcPr>
+        <w:p>
+          <w:pPr>
+            <w:pStyle w:val="Header"/>
+            <w:bidi w:val="0"/>
+            <w:jc w:val="center"/>
+          </w:pPr>
+        </w:p>
+      </w:tc>
+      <w:tc>
+        <w:tcPr>
+          <w:tcW w:w="3420" w:type="dxa"/>
+          <w:tcMar/>
+        </w:tcPr>
+        <w:p>
+          <w:pPr>
+            <w:pStyle w:val="Header"/>
+            <w:bidi w:val="0"/>
+            <w:ind w:right="-115"/>
+            <w:jc w:val="right"/>
+          </w:pPr>
+        </w:p>
+      </w:tc>
+    </w:tr>
+  </w:tbl>
+  <w:p>
+    <w:pPr>
+      <w:pStyle w:val="Header"/>
+      <w:bidi w:val="0"/>
+    </w:pPr>
+  </w:p>
+</w:hdr>
+</file>
+
+<file path=word/header5.xml><?xml version="1.0" encoding="utf-8"?>
+<w:hdr xmlns:w14="http://schemas.microsoft.com/office/word/2010/wordml" xmlns:w="http://schemas.openxmlformats.org/wordprocessingml/2006/main">
+  <w:tbl>
+    <w:tblPr>
+      <w:tblStyle w:val="Tabelanormal"/>
+      <w:bidiVisual w:val="0"/>
+      <w:tblW w:w="0" w:type="auto"/>
+      <w:tblLook w:val="06A0" w:firstRow="1" w:lastRow="0" w:firstColumn="1" w:lastColumn="0" w:noHBand="1" w:noVBand="1"/>
+    </w:tblPr>
+    <w:tblGrid>
+      <w:gridCol w:w="3420"/>
+      <w:gridCol w:w="3420"/>
+      <w:gridCol w:w="3420"/>
+    </w:tblGrid>
+    <w:tr>
+      <w:trPr>
+        <w:trHeight w:val="300"/>
+      </w:trPr>
+      <w:tc>
+        <w:tcPr>
+          <w:tcW w:w="3420" w:type="dxa"/>
+          <w:tcMar/>
+        </w:tcPr>
+        <w:p>
+          <w:pPr>
+            <w:pStyle w:val="Header"/>
+            <w:bidi w:val="0"/>
+            <w:ind w:left="-115"/>
+            <w:jc w:val="left"/>
+          </w:pPr>
+        </w:p>
+      </w:tc>
+      <w:tc>
+        <w:tcPr>
+          <w:tcW w:w="3420" w:type="dxa"/>
+          <w:tcMar/>
+        </w:tcPr>
+        <w:p>
+          <w:pPr>
+            <w:pStyle w:val="Header"/>
+            <w:bidi w:val="0"/>
+            <w:jc w:val="center"/>
+          </w:pPr>
+        </w:p>
+      </w:tc>
+      <w:tc>
+        <w:tcPr>
+          <w:tcW w:w="3420" w:type="dxa"/>
+          <w:tcMar/>
+        </w:tcPr>
+        <w:p>
+          <w:pPr>
+            <w:pStyle w:val="Header"/>
+            <w:bidi w:val="0"/>
+            <w:ind w:right="-115"/>
+            <w:jc w:val="right"/>
+          </w:pPr>
+        </w:p>
+      </w:tc>
+    </w:tr>
+  </w:tbl>
+  <w:p>
+    <w:pPr>
+      <w:pStyle w:val="Header"/>
+      <w:bidi w:val="0"/>
+    </w:pPr>
+  </w:p>
+</w:hdr>
+</file>
+
+<file path=word/header6.xml><?xml version="1.0" encoding="utf-8"?>
+<w:hdr xmlns:w14="http://schemas.microsoft.com/office/word/2010/wordml" xmlns:w="http://schemas.openxmlformats.org/wordprocessingml/2006/main">
+  <w:tbl>
+    <w:tblPr>
+      <w:tblStyle w:val="Tabelanormal"/>
+      <w:bidiVisual w:val="0"/>
+      <w:tblW w:w="0" w:type="auto"/>
+      <w:tblLook w:val="06A0" w:firstRow="1" w:lastRow="0" w:firstColumn="1" w:lastColumn="0" w:noHBand="1" w:noVBand="1"/>
+    </w:tblPr>
+    <w:tblGrid>
+      <w:gridCol w:w="3420"/>
+      <w:gridCol w:w="3420"/>
+      <w:gridCol w:w="3420"/>
+    </w:tblGrid>
+    <w:tr>
+      <w:trPr>
+        <w:trHeight w:val="300"/>
+      </w:trPr>
+      <w:tc>
+        <w:tcPr>
+          <w:tcW w:w="3420" w:type="dxa"/>
+          <w:tcMar/>
+        </w:tcPr>
+        <w:p>
+          <w:pPr>
+            <w:pStyle w:val="Header"/>
+            <w:bidi w:val="0"/>
+            <w:ind w:left="-115"/>
+            <w:jc w:val="left"/>
+          </w:pPr>
+        </w:p>
+      </w:tc>
+      <w:tc>
+        <w:tcPr>
+          <w:tcW w:w="3420" w:type="dxa"/>
+          <w:tcMar/>
+        </w:tcPr>
+        <w:p>
+          <w:pPr>
+            <w:pStyle w:val="Header"/>
+            <w:bidi w:val="0"/>
+            <w:jc w:val="center"/>
+          </w:pPr>
+        </w:p>
+      </w:tc>
+      <w:tc>
+        <w:tcPr>
+          <w:tcW w:w="3420" w:type="dxa"/>
+          <w:tcMar/>
+        </w:tcPr>
+        <w:p>
+          <w:pPr>
+            <w:pStyle w:val="Header"/>
+            <w:bidi w:val="0"/>
+            <w:ind w:right="-115"/>
+            <w:jc w:val="right"/>
+          </w:pPr>
+        </w:p>
+      </w:tc>
+    </w:tr>
+  </w:tbl>
+  <w:p>
+    <w:pPr>
+      <w:pStyle w:val="Header"/>
+      <w:bidi w:val="0"/>
+    </w:pPr>
+  </w:p>
+</w:hdr>
+</file>
+
+<file path=word/header7.xml><?xml version="1.0" encoding="utf-8"?>
+<w:hdr xmlns:w14="http://schemas.microsoft.com/office/word/2010/wordml" xmlns:w="http://schemas.openxmlformats.org/wordprocessingml/2006/main">
+  <w:tbl>
+    <w:tblPr>
+      <w:tblStyle w:val="Tabelanormal"/>
+      <w:bidiVisual w:val="0"/>
+      <w:tblW w:w="0" w:type="auto"/>
+      <w:tblLook w:val="06A0" w:firstRow="1" w:lastRow="0" w:firstColumn="1" w:lastColumn="0" w:noHBand="1" w:noVBand="1"/>
+    </w:tblPr>
+    <w:tblGrid>
+      <w:gridCol w:w="3420"/>
+      <w:gridCol w:w="3420"/>
+      <w:gridCol w:w="3420"/>
+    </w:tblGrid>
+    <w:tr>
+      <w:trPr>
+        <w:trHeight w:val="300"/>
+      </w:trPr>
+      <w:tc>
+        <w:tcPr>
+          <w:tcW w:w="3420" w:type="dxa"/>
+          <w:tcMar/>
+        </w:tcPr>
+        <w:p>
+          <w:pPr>
+            <w:pStyle w:val="Header"/>
+            <w:bidi w:val="0"/>
+            <w:ind w:left="-115"/>
+            <w:jc w:val="left"/>
+          </w:pPr>
+        </w:p>
+      </w:tc>
+      <w:tc>
+        <w:tcPr>
+          <w:tcW w:w="3420" w:type="dxa"/>
+          <w:tcMar/>
+        </w:tcPr>
+        <w:p>
+          <w:pPr>
+            <w:pStyle w:val="Header"/>
+            <w:bidi w:val="0"/>
+            <w:jc w:val="center"/>
+          </w:pPr>
+        </w:p>
+      </w:tc>
+      <w:tc>
+        <w:tcPr>
+          <w:tcW w:w="3420" w:type="dxa"/>
+          <w:tcMar/>
+        </w:tcPr>
+        <w:p>
+          <w:pPr>
+            <w:pStyle w:val="Header"/>
+            <w:bidi w:val="0"/>
+            <w:ind w:right="-115"/>
+            <w:jc w:val="right"/>
+          </w:pPr>
+        </w:p>
+      </w:tc>
+    </w:tr>
+  </w:tbl>
+  <w:p>
+    <w:pPr>
+      <w:pStyle w:val="Header"/>
+      <w:bidi w:val="0"/>
+    </w:pPr>
+  </w:p>
+</w:hdr>
+</file>
+
+<file path=word/header8.xml><?xml version="1.0" encoding="utf-8"?>
+<w:hdr xmlns:w14="http://schemas.microsoft.com/office/word/2010/wordml" xmlns:w="http://schemas.openxmlformats.org/wordprocessingml/2006/main">
+  <w:tbl>
+    <w:tblPr>
+      <w:tblStyle w:val="Tabelanormal"/>
+      <w:bidiVisual w:val="0"/>
+      <w:tblW w:w="0" w:type="auto"/>
+      <w:tblLook w:val="06A0" w:firstRow="1" w:lastRow="0" w:firstColumn="1" w:lastColumn="0" w:noHBand="1" w:noVBand="1"/>
+    </w:tblPr>
+    <w:tblGrid>
+      <w:gridCol w:w="3420"/>
+      <w:gridCol w:w="3420"/>
+      <w:gridCol w:w="3420"/>
+    </w:tblGrid>
+    <w:tr>
+      <w:trPr>
+        <w:trHeight w:val="300"/>
+      </w:trPr>
+      <w:tc>
+        <w:tcPr>
+          <w:tcW w:w="3420" w:type="dxa"/>
+          <w:tcMar/>
+        </w:tcPr>
+        <w:p>
+          <w:pPr>
+            <w:pStyle w:val="Header"/>
+            <w:bidi w:val="0"/>
+            <w:ind w:left="-115"/>
+            <w:jc w:val="left"/>
+          </w:pPr>
+        </w:p>
+      </w:tc>
+      <w:tc>
+        <w:tcPr>
+          <w:tcW w:w="3420" w:type="dxa"/>
+          <w:tcMar/>
+        </w:tcPr>
+        <w:p>
+          <w:pPr>
+            <w:pStyle w:val="Header"/>
+            <w:bidi w:val="0"/>
+            <w:jc w:val="center"/>
+          </w:pPr>
+        </w:p>
+      </w:tc>
+      <w:tc>
+        <w:tcPr>
+          <w:tcW w:w="3420" w:type="dxa"/>
+          <w:tcMar/>
+        </w:tcPr>
+        <w:p>
+          <w:pPr>
+            <w:pStyle w:val="Header"/>
+            <w:bidi w:val="0"/>
+            <w:ind w:right="-115"/>
+            <w:jc w:val="right"/>
+          </w:pPr>
+        </w:p>
+      </w:tc>
+    </w:tr>
+  </w:tbl>
+  <w:p>
+    <w:pPr>
+      <w:pStyle w:val="Header"/>
+      <w:bidi w:val="0"/>
+    </w:pPr>
+  </w:p>
+</w:hdr>
+</file>
+
+<file path=word/header9.xml><?xml version="1.0" encoding="utf-8"?>
+<w:hdr xmlns:w14="http://schemas.microsoft.com/office/word/2010/wordml" xmlns:w="http://schemas.openxmlformats.org/wordprocessingml/2006/main">
+  <w:tbl>
+    <w:tblPr>
+      <w:tblStyle w:val="Tabelanormal"/>
+      <w:bidiVisual w:val="0"/>
+      <w:tblW w:w="0" w:type="auto"/>
+      <w:tblLook w:val="06A0" w:firstRow="1" w:lastRow="0" w:firstColumn="1" w:lastColumn="0" w:noHBand="1" w:noVBand="1"/>
+    </w:tblPr>
+    <w:tblGrid>
+      <w:gridCol w:w="3420"/>
+      <w:gridCol w:w="3420"/>
+      <w:gridCol w:w="3420"/>
+    </w:tblGrid>
+    <w:tr>
+      <w:trPr>
+        <w:trHeight w:val="300"/>
+      </w:trPr>
+      <w:tc>
+        <w:tcPr>
+          <w:tcW w:w="3420" w:type="dxa"/>
+          <w:tcMar/>
+        </w:tcPr>
+        <w:p>
+          <w:pPr>
+            <w:pStyle w:val="Header"/>
+            <w:bidi w:val="0"/>
+            <w:ind w:left="-115"/>
+            <w:jc w:val="left"/>
+          </w:pPr>
+        </w:p>
+      </w:tc>
+      <w:tc>
+        <w:tcPr>
+          <w:tcW w:w="3420" w:type="dxa"/>
+          <w:tcMar/>
+        </w:tcPr>
+        <w:p>
+          <w:pPr>
+            <w:pStyle w:val="Header"/>
+            <w:bidi w:val="0"/>
+            <w:jc w:val="center"/>
+          </w:pPr>
+        </w:p>
+      </w:tc>
+      <w:tc>
+        <w:tcPr>
+          <w:tcW w:w="3420" w:type="dxa"/>
+          <w:tcMar/>
+        </w:tcPr>
+        <w:p>
+          <w:pPr>
+            <w:pStyle w:val="Header"/>
+            <w:bidi w:val="0"/>
+            <w:ind w:right="-115"/>
+            <w:jc w:val="right"/>
+          </w:pPr>
+        </w:p>
+      </w:tc>
+    </w:tr>
+  </w:tbl>
+  <w:p>
+    <w:pPr>
+      <w:pStyle w:val="Header"/>
+      <w:bidi w:val="0"/>
+    </w:pPr>
+  </w:p>
+</w:hdr>
+</file>
+
+<file path=word/headera.xml><?xml version="1.0" encoding="utf-8"?>
+<w:hdr xmlns:w14="http://schemas.microsoft.com/office/word/2010/wordml" xmlns:w="http://schemas.openxmlformats.org/wordprocessingml/2006/main">
+  <w:tbl>
+    <w:tblPr>
+      <w:tblStyle w:val="Tabelanormal"/>
+      <w:bidiVisual w:val="0"/>
+      <w:tblW w:w="0" w:type="auto"/>
+      <w:tblLook w:val="06A0" w:firstRow="1" w:lastRow="0" w:firstColumn="1" w:lastColumn="0" w:noHBand="1" w:noVBand="1"/>
+    </w:tblPr>
+    <w:tblGrid>
+      <w:gridCol w:w="3420"/>
+      <w:gridCol w:w="3420"/>
+      <w:gridCol w:w="3420"/>
+    </w:tblGrid>
+    <w:tr>
+      <w:trPr>
+        <w:trHeight w:val="300"/>
+      </w:trPr>
+      <w:tc>
+        <w:tcPr>
+          <w:tcW w:w="3420" w:type="dxa"/>
+          <w:tcMar/>
+        </w:tcPr>
+        <w:p>
+          <w:pPr>
+            <w:pStyle w:val="Header"/>
+            <w:bidi w:val="0"/>
+            <w:ind w:left="-115"/>
+            <w:jc w:val="left"/>
+          </w:pPr>
+        </w:p>
+      </w:tc>
+      <w:tc>
+        <w:tcPr>
+          <w:tcW w:w="3420" w:type="dxa"/>
+          <w:tcMar/>
+        </w:tcPr>
+        <w:p>
+          <w:pPr>
+            <w:pStyle w:val="Header"/>
+            <w:bidi w:val="0"/>
+            <w:jc w:val="center"/>
+          </w:pPr>
+        </w:p>
+      </w:tc>
+      <w:tc>
+        <w:tcPr>
+          <w:tcW w:w="3420" w:type="dxa"/>
+          <w:tcMar/>
+        </w:tcPr>
+        <w:p>
+          <w:pPr>
+            <w:pStyle w:val="Header"/>
+            <w:bidi w:val="0"/>
+            <w:ind w:right="-115"/>
+            <w:jc w:val="right"/>
+          </w:pPr>
+        </w:p>
+      </w:tc>
+    </w:tr>
+  </w:tbl>
+  <w:p>
+    <w:pPr>
+      <w:pStyle w:val="Header"/>
+      <w:bidi w:val="0"/>
+    </w:pPr>
+  </w:p>
+</w:hdr>
+</file>
+
+<file path=word/intelligence2.xml><?xml version="1.0" encoding="utf-8"?>
+<int2:intelligence xmlns:int2="http://schemas.microsoft.com/office/intelligence/2020/intelligence">
+  <int2:observations>
+    <int2:bookmark int2:bookmarkName="_Int_Na7BhTTV" int2:invalidationBookmarkName="" int2:hashCode="KvLmuIG9rRXUO+" int2:id="y4vBXTRg">
+      <int2:state int2:type="gram" int2:value="Rejected"/>
+    </int2:bookmark>
+  </int2:observations>
+  <int2:intelligenceSettings/>
+</int2:intelligence>
 </file>
 
 <file path=word/styles.xml><?xml version="1.0" encoding="utf-8"?>
@@ -2214,6 +4141,70 @@
       </w:tblCellMar>
     </w:tblPr>
   </w:style>
+  <w:style w:type="paragraph" w:styleId="BodyText">
+    <w:uiPriority w:val="99"/>
+    <w:name w:val="Body Text"/>
+    <w:basedOn w:val="Normal"/>
+    <w:unhideWhenUsed/>
+    <w:rsid w:val="55F6A5E5"/>
+    <w:pPr>
+      <w:spacing w:after="120"/>
+    </w:pPr>
+  </w:style>
+  <w:style w:type="paragraph" w:styleId="Header">
+    <w:uiPriority w:val="99"/>
+    <w:name w:val="header"/>
+    <w:basedOn w:val="Normal"/>
+    <w:unhideWhenUsed/>
+    <w:rsid w:val="55F6A5E5"/>
+    <w:pPr>
+      <w:tabs>
+        <w:tab w:val="center" w:leader="none" w:pos="4680"/>
+        <w:tab w:val="right" w:leader="none" w:pos="9360"/>
+      </w:tabs>
+      <w:spacing w:after="0" w:line="240" w:lineRule="auto"/>
+    </w:pPr>
+  </w:style>
+  <w:style w:type="paragraph" w:styleId="Footer">
+    <w:uiPriority w:val="99"/>
+    <w:name w:val="footer"/>
+    <w:basedOn w:val="Normal"/>
+    <w:unhideWhenUsed/>
+    <w:rsid w:val="55F6A5E5"/>
+    <w:pPr>
+      <w:tabs>
+        <w:tab w:val="center" w:leader="none" w:pos="4680"/>
+        <w:tab w:val="right" w:leader="none" w:pos="9360"/>
+      </w:tabs>
+      <w:spacing w:after="0" w:line="240" w:lineRule="auto"/>
+    </w:pPr>
+  </w:style>
+  <w:style xmlns:w="http://schemas.openxmlformats.org/wordprocessingml/2006/main" w:type="table" w:styleId="TableGrid">
+    <w:name xmlns:w="http://schemas.openxmlformats.org/wordprocessingml/2006/main" w:val="Table Grid"/>
+    <w:basedOn xmlns:w="http://schemas.openxmlformats.org/wordprocessingml/2006/main" w:val="Tabelanormal"/>
+    <w:uiPriority xmlns:w="http://schemas.openxmlformats.org/wordprocessingml/2006/main" w:val="59"/>
+    <w:rsid xmlns:w="http://schemas.openxmlformats.org/wordprocessingml/2006/main" w:val="00FB4123"/>
+    <w:pPr xmlns:w="http://schemas.openxmlformats.org/wordprocessingml/2006/main">
+      <w:spacing w:after="0" w:line="240" w:lineRule="auto"/>
+    </w:pPr>
+    <w:tblPr xmlns:w="http://schemas.openxmlformats.org/wordprocessingml/2006/main">
+      <w:tblInd w:w="0" w:type="dxa"/>
+      <w:tblBorders>
+        <w:top w:val="single" w:color="000000" w:themeColor="text1" w:sz="4" w:space="0"/>
+        <w:left w:val="single" w:color="000000" w:themeColor="text1" w:sz="4" w:space="0"/>
+        <w:bottom w:val="single" w:color="000000" w:themeColor="text1" w:sz="4" w:space="0"/>
+        <w:right w:val="single" w:color="000000" w:themeColor="text1" w:sz="4" w:space="0"/>
+        <w:insideH w:val="single" w:color="000000" w:themeColor="text1" w:sz="4" w:space="0"/>
+        <w:insideV w:val="single" w:color="000000" w:themeColor="text1" w:sz="4" w:space="0"/>
+      </w:tblBorders>
+      <w:tblCellMar>
+        <w:top w:w="0" w:type="dxa"/>
+        <w:left w:w="108" w:type="dxa"/>
+        <w:bottom w:w="0" w:type="dxa"/>
+        <w:right w:w="108" w:type="dxa"/>
+      </w:tblCellMar>
+    </w:tblPr>
+  </w:style>
 </w:styles>
 </file>
 

</xml_diff>